<commit_message>
feat: rigor ampliado (quiebres, iliquidez multi-proxy, fuera de muestra) + PPT defensa + plataforma con 2 gráficos nuevos
Tesis (44 pág): identificación/exogeneidad, significancia económica, quiebres
estructurales (Quandt-Andrews), robustez de iliquidez (4 proxies), validación
fuera de muestra (Clark-West) con placebo SQM, +10 referencias reales, DAS.
Nuevos módulos: src/quiebres.py, iliquidez_robustez.py, out_of_sample.py.
PPT: docs/Tesis_USS_Defensa.pptx (15 slides). Plataforma: sección Robustez con
gráficos OOS y quiebre, descarga PPTX. Proyectos tesis/plataforma separados.

Co-Authored-By: Claude Opus 4.8 <noreply@anthropic.com>
</commit_message>
<xml_diff>
--- a/docs/Tesis_USS.docx
+++ b/docs/Tesis_USS.docx
@@ -2583,7 +2583,57 @@
     </w:p>
     <w:p>
       <w:r>
-        <w:t>Toda-Yamamoto contrasta directamente.</w:t>
+        <w:t>Toda-Yamamoto contrasta directamente. El antecedente más directo es Mendiola,</w:t>
+      </w:r>
+    </w:p>
+    <w:p>
+      <w:r>
+        <w:t>Chávez-Bedoya y Wallenstein (2022), que documentan una relación **positiva pero</w:t>
+      </w:r>
+    </w:p>
+    <w:p>
+      <w:r>
+        <w:t>inelástica** entre los cambios del precio del cobre y los retornos de acciones</w:t>
+      </w:r>
+    </w:p>
+    <w:p>
+      <w:r>
+        <w:t>mineras de cobre —precisamente la magnitud que esta tesis estima y descompone por</w:t>
+      </w:r>
+    </w:p>
+    <w:p>
+      <w:r>
+        <w:t>horizonte—. Kilian y Park (2009) advierten que el efecto de un shock de commodity</w:t>
+      </w:r>
+    </w:p>
+    <w:p>
+      <w:r>
+        <w:t>sobre las acciones depende de si es de oferta o de demanda, y Díaz, Hansen y Cabrera</w:t>
+      </w:r>
+    </w:p>
+    <w:p>
+      <w:r>
+        <w:t>(2021) —autores chilenos— muestran que variables macro-financieras (VIX, incertidumbre,</w:t>
+      </w:r>
+    </w:p>
+    <w:p>
+      <w:r>
+        <w:t>ciclo) gobiernan la volatilidad del cobre, respaldando el conjunto de regresores</w:t>
+      </w:r>
+    </w:p>
+    <w:p>
+      <w:r>
+        <w:t>empleado. Gorton y Rouwenhorst (2006) y Cashin et al. (2002) enmarcan, además, el</w:t>
+      </w:r>
+    </w:p>
+    <w:p>
+      <w:r>
+        <w:t>comportamiento cíclico y asimétrico de los precios de commodities que motiva la</w:t>
+      </w:r>
+    </w:p>
+    <w:p>
+      <w:r>
+        <w:t>especificación NARDL.</w:t>
       </w:r>
     </w:p>
     <w:p>
@@ -2656,7 +2706,32 @@
     </w:p>
     <w:p>
       <w:r>
-        <w:t>capitalización.</w:t>
+        <w:t>capitalización. Bekaert, Harvey y Lundblad (2007) muestran que la liquidez local es</w:t>
+      </w:r>
+    </w:p>
+    <w:p>
+      <w:r>
+        <w:t>un determinante de primer orden de los retornos esperados en mercados emergentes, y</w:t>
+      </w:r>
+    </w:p>
+    <w:p>
+      <w:r>
+        <w:t>Amihud, Hameed, Kang y Zhang (2015) documentan que el premio por iliquidez se</w:t>
+      </w:r>
+    </w:p>
+    <w:p>
+      <w:r>
+        <w:t>concentra en las firmas más pequeñas a nivel internacional —justo el perfil de</w:t>
+      </w:r>
+    </w:p>
+    <w:p>
+      <w:r>
+        <w:t>Pucobre—; para mercados ilíquidos, la proporción de días con retorno cero suele</w:t>
+      </w:r>
+    </w:p>
+    <w:p>
+      <w:r>
+        <w:t>superar a Amihud como proxy, lo que motiva el uso de múltiples medidas en §6.14.</w:t>
       </w:r>
     </w:p>
     <w:p>
@@ -5009,6 +5084,200 @@
         <w:pStyle w:val="Heading3"/>
       </w:pPr>
       <w:r>
+        <w:t>5.0 Estrategia de identificación</w:t>
+      </w:r>
+    </w:p>
+    <w:p>
+      <w:r>
+        <w:t>La pregunta causal —¿cómo afecta el precio del cobre a la valoración de una minera</w:t>
+      </w:r>
+    </w:p>
+    <w:p>
+      <w:r>
+        <w:t>chilena?— enfrenta el riesgo habitual de endogeneidad. Aquí, sin embargo, la</w:t>
+      </w:r>
+    </w:p>
+    <w:p>
+      <w:r>
+        <w:t>identificación se apoya en dos pilares razonables:</w:t>
+      </w:r>
+    </w:p>
+    <w:p>
+      <w:pPr>
+        <w:pStyle w:val="ListNumber"/>
+      </w:pPr>
+      <w:r/>
+      <w:r>
+        <w:rPr>
+          <w:b/>
+        </w:rPr>
+        <w:t>El cobre como shock externo (cuasi-exógeno).</w:t>
+      </w:r>
+      <w:r>
+        <w:t xml:space="preserve"> El precio del cobre se determina</w:t>
+      </w:r>
+    </w:p>
+    <w:p>
+      <w:r>
+        <w:t>en mercados globales (LME/COMEX) por la oferta y demanda mundiales —dominadas por</w:t>
+      </w:r>
+    </w:p>
+    <w:p>
+      <w:r>
+        <w:t>China—; dos empresas chilenas, una de ellas pequeña, **no mueven el precio</w:t>
+      </w:r>
+    </w:p>
+    <w:p>
+      <w:r>
+        <w:t>mundial**. Esta exogeneidad se contrasta empíricamente: el test de Toda-Yamamoto</w:t>
+      </w:r>
+    </w:p>
+    <w:p>
+      <w:r>
+        <w:t xml:space="preserve">arroja causalidad </w:t>
+      </w:r>
+      <w:r>
+        <w:rPr>
+          <w:b/>
+        </w:rPr>
+        <w:t>unidireccional</w:t>
+      </w:r>
+      <w:r>
+        <w:t xml:space="preserve"> cobre→Antofagasta (§6.11), descartando</w:t>
+      </w:r>
+    </w:p>
+    <w:p>
+      <w:r>
+        <w:t>retroalimentación. El cobre opera, así, como una fuente de variación plausiblemente</w:t>
+      </w:r>
+    </w:p>
+    <w:p>
+      <w:r>
+        <w:t>exógena para la valoración local.</w:t>
+      </w:r>
+    </w:p>
+    <w:p>
+      <w:pPr>
+        <w:pStyle w:val="ListNumber"/>
+      </w:pPr>
+      <w:r/>
+      <w:r>
+        <w:rPr>
+          <w:b/>
+        </w:rPr>
+        <w:t>Diseño cuasi-experimental por liquidez.</w:t>
+      </w:r>
+      <w:r>
+        <w:t xml:space="preserve"> Antofagasta y Pucobre comparten la</w:t>
+      </w:r>
+    </w:p>
+    <w:p>
+      <w:r/>
+      <w:r>
+        <w:rPr>
+          <w:b/>
+        </w:rPr>
+        <w:t>misma exposición fundamental</w:t>
+      </w:r>
+      <w:r>
+        <w:t xml:space="preserve"> al cobre (ambos son pure-plays) pero difieren</w:t>
+      </w:r>
+    </w:p>
+    <w:p>
+      <w:r>
+        <w:t xml:space="preserve">radicalmente en </w:t>
+      </w:r>
+      <w:r>
+        <w:rPr>
+          <w:b/>
+        </w:rPr>
+        <w:t>microestructura</w:t>
+      </w:r>
+      <w:r>
+        <w:t xml:space="preserve"> (liquidez). Comparar la velocidad de</w:t>
+      </w:r>
+    </w:p>
+    <w:p>
+      <w:r>
+        <w:t xml:space="preserve">transmisión entre ambos </w:t>
+      </w:r>
+      <w:r>
+        <w:rPr>
+          <w:b/>
+        </w:rPr>
+        <w:t>aísla el efecto de la liquidez</w:t>
+      </w:r>
+      <w:r>
+        <w:t>, manteniendo</w:t>
+      </w:r>
+    </w:p>
+    <w:p>
+      <w:r>
+        <w:t>aproximadamente constante el fundamento: las referencias internacionales</w:t>
+      </w:r>
+    </w:p>
+    <w:p>
+      <w:r>
+        <w:t>(SCCO/FCX/BHP/GLEN) y los materiales chilenos (CAP/SQM) sirven como benchmarks de</w:t>
+      </w:r>
+    </w:p>
+    <w:p>
+      <w:r>
+        <w:t>exposición. La diferencia sistemática en el horizonte de transmisión —no en el</w:t>
+      </w:r>
+    </w:p>
+    <w:p>
+      <w:r>
+        <w:t>nivel de largo plazo— es, por tanto, atribuible a la fricción de liquidez, no a una</w:t>
+      </w:r>
+    </w:p>
+    <w:p>
+      <w:r>
+        <w:t>desconexión fundamental.</w:t>
+      </w:r>
+    </w:p>
+    <w:p>
+      <w:r/>
+      <w:r>
+        <w:rPr>
+          <w:b/>
+        </w:rPr>
+        <w:t>Variables omitidas.</w:t>
+      </w:r>
+      <w:r>
+        <w:t xml:space="preserve"> El diseño controla por los factores globales que podrían</w:t>
+      </w:r>
+    </w:p>
+    <w:p>
+      <w:r>
+        <w:t>confundir el canal del cobre —dólar (DXY), tasas (UST), riesgo (VIX), mercado (S&amp;P y</w:t>
+      </w:r>
+    </w:p>
+    <w:p>
+      <w:r>
+        <w:t>proxy local) y energía (WTI)—, de modo que la elasticidad-cobre estimada es</w:t>
+      </w:r>
+    </w:p>
+    <w:p>
+      <w:r>
+        <w:t>incremental respecto de ese comovimiento. Residualmente, factores idiosincrásicos de</w:t>
+      </w:r>
+    </w:p>
+    <w:p>
+      <w:r>
+        <w:t>empresa (anuncios, guidance, gobierno corporativo) quedan en el error; su efecto se</w:t>
+      </w:r>
+    </w:p>
+    <w:p>
+      <w:r>
+        <w:t>mitiga al trabajar con retornos y se discute como limitación.</w:t>
+      </w:r>
+    </w:p>
+    <w:p>
+      <w:pPr>
+        <w:pStyle w:val="Heading3"/>
+      </w:pPr>
+      <w:r>
         <w:t>5.1 Pruebas previas</w:t>
       </w:r>
     </w:p>
@@ -9765,7 +10034,1807 @@
         <w:pStyle w:val="Heading3"/>
       </w:pPr>
       <w:r>
-        <w:t>6.13 Síntesis de verificación de hipótesis</w:t>
+        <w:t>6.13 Quiebres estructurales endógenos (Quandt-Andrews)</w:t>
+      </w:r>
+    </w:p>
+    <w:p>
+      <w:r>
+        <w:t>Para evaluar la estabilidad de la transmisión en 22 años (que abarcan la crisis de</w:t>
+      </w:r>
+    </w:p>
+    <w:p>
+      <w:r>
+        <w:t>2008, el superciclo, el COVID y el boom pospandemia), se aplica una prueba de quiebre</w:t>
+      </w:r>
+    </w:p>
+    <w:p>
+      <w:r>
+        <w:t>con fecha endógena (sup-Chow / Quandt-Andrews, trimming 15%) sobre la regresión</w:t>
+      </w:r>
+    </w:p>
+    <w:p>
+      <w:r>
+        <w:t>r = a + b·Δcobre + controles:</w:t>
+      </w:r>
+    </w:p>
+    <w:tbl>
+      <w:tblPr>
+        <w:tblStyle w:val="LightGrid-Accent1"/>
+        <w:tblW w:type="auto" w:w="0"/>
+        <w:jc w:val="center"/>
+        <w:tblLook w:firstColumn="1" w:firstRow="1" w:lastColumn="0" w:lastRow="0" w:noHBand="0" w:noVBand="1" w:val="04A0"/>
+      </w:tblPr>
+      <w:tblGrid>
+        <w:gridCol w:w="1520"/>
+        <w:gridCol w:w="1520"/>
+        <w:gridCol w:w="1520"/>
+        <w:gridCol w:w="1520"/>
+        <w:gridCol w:w="1520"/>
+        <w:gridCol w:w="1520"/>
+      </w:tblGrid>
+      <w:tr>
+        <w:tc>
+          <w:tcPr>
+            <w:tcW w:type="dxa" w:w="1520"/>
+            <w:shd w:val="clear" w:fill="1B2A41"/>
+          </w:tcPr>
+          <w:p>
+            <w:pPr>
+              <w:jc w:val="center"/>
+            </w:pPr>
+            <w:r/>
+            <w:r>
+              <w:rPr>
+                <w:rFonts w:ascii="Times New Roman" w:hAnsi="Times New Roman"/>
+                <w:b/>
+                <w:color w:val="FFFFFF"/>
+                <w:sz w:val="19"/>
+              </w:rPr>
+              <w:t>Activo</w:t>
+            </w:r>
+          </w:p>
+        </w:tc>
+        <w:tc>
+          <w:tcPr>
+            <w:tcW w:type="dxa" w:w="1520"/>
+            <w:shd w:val="clear" w:fill="1B2A41"/>
+          </w:tcPr>
+          <w:p>
+            <w:pPr>
+              <w:jc w:val="center"/>
+            </w:pPr>
+            <w:r/>
+            <w:r>
+              <w:rPr>
+                <w:rFonts w:ascii="Times New Roman" w:hAnsi="Times New Roman"/>
+                <w:b/>
+                <w:color w:val="FFFFFF"/>
+                <w:sz w:val="19"/>
+              </w:rPr>
+              <w:t>sup-F</w:t>
+            </w:r>
+          </w:p>
+        </w:tc>
+        <w:tc>
+          <w:tcPr>
+            <w:tcW w:type="dxa" w:w="1520"/>
+            <w:shd w:val="clear" w:fill="1B2A41"/>
+          </w:tcPr>
+          <w:p>
+            <w:pPr>
+              <w:jc w:val="center"/>
+            </w:pPr>
+            <w:r/>
+            <w:r>
+              <w:rPr>
+                <w:rFonts w:ascii="Times New Roman" w:hAnsi="Times New Roman"/>
+                <w:b/>
+                <w:color w:val="FFFFFF"/>
+                <w:sz w:val="19"/>
+              </w:rPr>
+              <w:t>crítico 5%</w:t>
+            </w:r>
+          </w:p>
+        </w:tc>
+        <w:tc>
+          <w:tcPr>
+            <w:tcW w:type="dxa" w:w="1520"/>
+            <w:shd w:val="clear" w:fill="1B2A41"/>
+          </w:tcPr>
+          <w:p>
+            <w:pPr>
+              <w:jc w:val="center"/>
+            </w:pPr>
+            <w:r/>
+            <w:r>
+              <w:rPr>
+                <w:rFonts w:ascii="Times New Roman" w:hAnsi="Times New Roman"/>
+                <w:b/>
+                <w:color w:val="FFFFFF"/>
+                <w:sz w:val="19"/>
+              </w:rPr>
+              <w:t>fecha de quiebre</w:t>
+            </w:r>
+          </w:p>
+        </w:tc>
+        <w:tc>
+          <w:tcPr>
+            <w:tcW w:type="dxa" w:w="1520"/>
+            <w:shd w:val="clear" w:fill="1B2A41"/>
+          </w:tcPr>
+          <w:p>
+            <w:pPr>
+              <w:jc w:val="center"/>
+            </w:pPr>
+            <w:r/>
+            <w:r>
+              <w:rPr>
+                <w:rFonts w:ascii="Times New Roman" w:hAnsi="Times New Roman"/>
+                <w:b/>
+                <w:color w:val="FFFFFF"/>
+                <w:sz w:val="19"/>
+              </w:rPr>
+              <w:t>β-cobre pre → post</w:t>
+            </w:r>
+          </w:p>
+        </w:tc>
+        <w:tc>
+          <w:tcPr>
+            <w:tcW w:type="dxa" w:w="1520"/>
+            <w:shd w:val="clear" w:fill="1B2A41"/>
+          </w:tcPr>
+          <w:p>
+            <w:pPr>
+              <w:jc w:val="center"/>
+            </w:pPr>
+            <w:r/>
+            <w:r>
+              <w:rPr>
+                <w:rFonts w:ascii="Times New Roman" w:hAnsi="Times New Roman"/>
+                <w:b/>
+                <w:color w:val="FFFFFF"/>
+                <w:sz w:val="19"/>
+              </w:rPr>
+              <w:t>¿quiebre?</w:t>
+            </w:r>
+          </w:p>
+        </w:tc>
+      </w:tr>
+      <w:tr>
+        <w:tc>
+          <w:tcPr>
+            <w:tcW w:type="dxa" w:w="1520"/>
+          </w:tcPr>
+          <w:p>
+            <w:pPr>
+              <w:jc w:val="center"/>
+            </w:pPr>
+            <w:r/>
+            <w:r>
+              <w:rPr>
+                <w:rFonts w:ascii="Times New Roman" w:hAnsi="Times New Roman"/>
+                <w:sz w:val="19"/>
+              </w:rPr>
+              <w:t>ANTO.L</w:t>
+            </w:r>
+          </w:p>
+        </w:tc>
+        <w:tc>
+          <w:tcPr>
+            <w:tcW w:type="dxa" w:w="1520"/>
+          </w:tcPr>
+          <w:p>
+            <w:pPr>
+              <w:jc w:val="center"/>
+            </w:pPr>
+            <w:r/>
+            <w:r>
+              <w:rPr>
+                <w:rFonts w:ascii="Times New Roman" w:hAnsi="Times New Roman"/>
+                <w:sz w:val="19"/>
+              </w:rPr>
+              <w:t>33.5</w:t>
+            </w:r>
+          </w:p>
+        </w:tc>
+        <w:tc>
+          <w:tcPr>
+            <w:tcW w:type="dxa" w:w="1520"/>
+          </w:tcPr>
+          <w:p>
+            <w:pPr>
+              <w:jc w:val="center"/>
+            </w:pPr>
+            <w:r/>
+            <w:r>
+              <w:rPr>
+                <w:rFonts w:ascii="Times New Roman" w:hAnsi="Times New Roman"/>
+                <w:sz w:val="19"/>
+              </w:rPr>
+              <w:t>~18.0</w:t>
+            </w:r>
+          </w:p>
+        </w:tc>
+        <w:tc>
+          <w:tcPr>
+            <w:tcW w:type="dxa" w:w="1520"/>
+          </w:tcPr>
+          <w:p>
+            <w:pPr>
+              <w:jc w:val="center"/>
+            </w:pPr>
+            <w:r/>
+            <w:r>
+              <w:rPr>
+                <w:rFonts w:ascii="Times New Roman" w:hAnsi="Times New Roman"/>
+                <w:sz w:val="19"/>
+              </w:rPr>
+              <w:t>2007-07</w:t>
+            </w:r>
+          </w:p>
+        </w:tc>
+        <w:tc>
+          <w:tcPr>
+            <w:tcW w:type="dxa" w:w="1520"/>
+          </w:tcPr>
+          <w:p>
+            <w:pPr>
+              <w:jc w:val="center"/>
+            </w:pPr>
+            <w:r/>
+            <w:r>
+              <w:rPr>
+                <w:rFonts w:ascii="Times New Roman" w:hAnsi="Times New Roman"/>
+                <w:sz w:val="19"/>
+              </w:rPr>
+              <w:t>0.34 → 0.78</w:t>
+            </w:r>
+          </w:p>
+        </w:tc>
+        <w:tc>
+          <w:tcPr>
+            <w:tcW w:type="dxa" w:w="1520"/>
+          </w:tcPr>
+          <w:p>
+            <w:pPr>
+              <w:jc w:val="center"/>
+            </w:pPr>
+            <w:r/>
+            <w:r>
+              <w:rPr>
+                <w:rFonts w:ascii="Times New Roman" w:hAnsi="Times New Roman"/>
+                <w:sz w:val="19"/>
+              </w:rPr>
+              <w:t>Sí</w:t>
+            </w:r>
+          </w:p>
+        </w:tc>
+      </w:tr>
+      <w:tr>
+        <w:tc>
+          <w:tcPr>
+            <w:tcW w:type="dxa" w:w="1520"/>
+          </w:tcPr>
+          <w:p>
+            <w:pPr>
+              <w:jc w:val="center"/>
+            </w:pPr>
+            <w:r/>
+            <w:r>
+              <w:rPr>
+                <w:rFonts w:ascii="Times New Roman" w:hAnsi="Times New Roman"/>
+                <w:sz w:val="19"/>
+              </w:rPr>
+              <w:t>PUCOBRE.SN</w:t>
+            </w:r>
+          </w:p>
+        </w:tc>
+        <w:tc>
+          <w:tcPr>
+            <w:tcW w:type="dxa" w:w="1520"/>
+          </w:tcPr>
+          <w:p>
+            <w:pPr>
+              <w:jc w:val="center"/>
+            </w:pPr>
+            <w:r/>
+            <w:r>
+              <w:rPr>
+                <w:rFonts w:ascii="Times New Roman" w:hAnsi="Times New Roman"/>
+                <w:sz w:val="19"/>
+              </w:rPr>
+              <w:t>7.8</w:t>
+            </w:r>
+          </w:p>
+        </w:tc>
+        <w:tc>
+          <w:tcPr>
+            <w:tcW w:type="dxa" w:w="1520"/>
+          </w:tcPr>
+          <w:p>
+            <w:pPr>
+              <w:jc w:val="center"/>
+            </w:pPr>
+            <w:r/>
+            <w:r>
+              <w:rPr>
+                <w:rFonts w:ascii="Times New Roman" w:hAnsi="Times New Roman"/>
+                <w:sz w:val="19"/>
+              </w:rPr>
+              <w:t>~18.0</w:t>
+            </w:r>
+          </w:p>
+        </w:tc>
+        <w:tc>
+          <w:tcPr>
+            <w:tcW w:type="dxa" w:w="1520"/>
+          </w:tcPr>
+          <w:p>
+            <w:pPr>
+              <w:jc w:val="center"/>
+            </w:pPr>
+            <w:r/>
+            <w:r>
+              <w:rPr>
+                <w:rFonts w:ascii="Times New Roman" w:hAnsi="Times New Roman"/>
+                <w:sz w:val="19"/>
+              </w:rPr>
+              <w:t>2010-12</w:t>
+            </w:r>
+          </w:p>
+        </w:tc>
+        <w:tc>
+          <w:tcPr>
+            <w:tcW w:type="dxa" w:w="1520"/>
+          </w:tcPr>
+          <w:p>
+            <w:pPr>
+              <w:jc w:val="center"/>
+            </w:pPr>
+            <w:r/>
+            <w:r>
+              <w:rPr>
+                <w:rFonts w:ascii="Times New Roman" w:hAnsi="Times New Roman"/>
+                <w:sz w:val="19"/>
+              </w:rPr>
+              <w:t>0.08 → 0.13</w:t>
+            </w:r>
+          </w:p>
+        </w:tc>
+        <w:tc>
+          <w:tcPr>
+            <w:tcW w:type="dxa" w:w="1520"/>
+          </w:tcPr>
+          <w:p>
+            <w:pPr>
+              <w:jc w:val="center"/>
+            </w:pPr>
+            <w:r/>
+            <w:r>
+              <w:rPr>
+                <w:rFonts w:ascii="Times New Roman" w:hAnsi="Times New Roman"/>
+                <w:sz w:val="19"/>
+              </w:rPr>
+              <w:t>No al 5%</w:t>
+            </w:r>
+          </w:p>
+        </w:tc>
+      </w:tr>
+      <w:tr>
+        <w:tc>
+          <w:tcPr>
+            <w:tcW w:type="dxa" w:w="1520"/>
+          </w:tcPr>
+          <w:p>
+            <w:pPr>
+              <w:jc w:val="center"/>
+            </w:pPr>
+            <w:r/>
+            <w:r>
+              <w:rPr>
+                <w:rFonts w:ascii="Times New Roman" w:hAnsi="Times New Roman"/>
+                <w:sz w:val="19"/>
+              </w:rPr>
+              <w:t>CAP.SN</w:t>
+            </w:r>
+          </w:p>
+        </w:tc>
+        <w:tc>
+          <w:tcPr>
+            <w:tcW w:type="dxa" w:w="1520"/>
+          </w:tcPr>
+          <w:p>
+            <w:pPr>
+              <w:jc w:val="center"/>
+            </w:pPr>
+            <w:r/>
+            <w:r>
+              <w:rPr>
+                <w:rFonts w:ascii="Times New Roman" w:hAnsi="Times New Roman"/>
+                <w:sz w:val="19"/>
+              </w:rPr>
+              <w:t>12.4</w:t>
+            </w:r>
+          </w:p>
+        </w:tc>
+        <w:tc>
+          <w:tcPr>
+            <w:tcW w:type="dxa" w:w="1520"/>
+          </w:tcPr>
+          <w:p>
+            <w:pPr>
+              <w:jc w:val="center"/>
+            </w:pPr>
+            <w:r/>
+            <w:r>
+              <w:rPr>
+                <w:rFonts w:ascii="Times New Roman" w:hAnsi="Times New Roman"/>
+                <w:sz w:val="19"/>
+              </w:rPr>
+              <w:t>~18.0</w:t>
+            </w:r>
+          </w:p>
+        </w:tc>
+        <w:tc>
+          <w:tcPr>
+            <w:tcW w:type="dxa" w:w="1520"/>
+          </w:tcPr>
+          <w:p>
+            <w:pPr>
+              <w:jc w:val="center"/>
+            </w:pPr>
+            <w:r/>
+            <w:r>
+              <w:rPr>
+                <w:rFonts w:ascii="Times New Roman" w:hAnsi="Times New Roman"/>
+                <w:sz w:val="19"/>
+              </w:rPr>
+              <w:t>2011-01</w:t>
+            </w:r>
+          </w:p>
+        </w:tc>
+        <w:tc>
+          <w:tcPr>
+            <w:tcW w:type="dxa" w:w="1520"/>
+          </w:tcPr>
+          <w:p>
+            <w:pPr>
+              <w:jc w:val="center"/>
+            </w:pPr>
+            <w:r/>
+            <w:r>
+              <w:rPr>
+                <w:rFonts w:ascii="Times New Roman" w:hAnsi="Times New Roman"/>
+                <w:sz w:val="19"/>
+              </w:rPr>
+              <w:t>0.12 → 0.35</w:t>
+            </w:r>
+          </w:p>
+        </w:tc>
+        <w:tc>
+          <w:tcPr>
+            <w:tcW w:type="dxa" w:w="1520"/>
+          </w:tcPr>
+          <w:p>
+            <w:pPr>
+              <w:jc w:val="center"/>
+            </w:pPr>
+            <w:r/>
+            <w:r>
+              <w:rPr>
+                <w:rFonts w:ascii="Times New Roman" w:hAnsi="Times New Roman"/>
+                <w:sz w:val="19"/>
+              </w:rPr>
+              <w:t>No al 5%</w:t>
+            </w:r>
+          </w:p>
+        </w:tc>
+      </w:tr>
+      <w:tr>
+        <w:tc>
+          <w:tcPr>
+            <w:tcW w:type="dxa" w:w="1520"/>
+          </w:tcPr>
+          <w:p>
+            <w:pPr>
+              <w:jc w:val="center"/>
+            </w:pPr>
+            <w:r/>
+            <w:r>
+              <w:rPr>
+                <w:rFonts w:ascii="Times New Roman" w:hAnsi="Times New Roman"/>
+                <w:sz w:val="19"/>
+              </w:rPr>
+              <w:t>SQM-B.SN</w:t>
+            </w:r>
+          </w:p>
+        </w:tc>
+        <w:tc>
+          <w:tcPr>
+            <w:tcW w:type="dxa" w:w="1520"/>
+          </w:tcPr>
+          <w:p>
+            <w:pPr>
+              <w:jc w:val="center"/>
+            </w:pPr>
+            <w:r/>
+            <w:r>
+              <w:rPr>
+                <w:rFonts w:ascii="Times New Roman" w:hAnsi="Times New Roman"/>
+                <w:sz w:val="19"/>
+              </w:rPr>
+              <w:t>11.1</w:t>
+            </w:r>
+          </w:p>
+        </w:tc>
+        <w:tc>
+          <w:tcPr>
+            <w:tcW w:type="dxa" w:w="1520"/>
+          </w:tcPr>
+          <w:p>
+            <w:pPr>
+              <w:jc w:val="center"/>
+            </w:pPr>
+            <w:r/>
+            <w:r>
+              <w:rPr>
+                <w:rFonts w:ascii="Times New Roman" w:hAnsi="Times New Roman"/>
+                <w:sz w:val="19"/>
+              </w:rPr>
+              <w:t>~18.0</w:t>
+            </w:r>
+          </w:p>
+        </w:tc>
+        <w:tc>
+          <w:tcPr>
+            <w:tcW w:type="dxa" w:w="1520"/>
+          </w:tcPr>
+          <w:p>
+            <w:pPr>
+              <w:jc w:val="center"/>
+            </w:pPr>
+            <w:r/>
+            <w:r>
+              <w:rPr>
+                <w:rFonts w:ascii="Times New Roman" w:hAnsi="Times New Roman"/>
+                <w:sz w:val="19"/>
+              </w:rPr>
+              <w:t>2019-06</w:t>
+            </w:r>
+          </w:p>
+        </w:tc>
+        <w:tc>
+          <w:tcPr>
+            <w:tcW w:type="dxa" w:w="1520"/>
+          </w:tcPr>
+          <w:p>
+            <w:pPr>
+              <w:jc w:val="center"/>
+            </w:pPr>
+            <w:r/>
+            <w:r>
+              <w:rPr>
+                <w:rFonts w:ascii="Times New Roman" w:hAnsi="Times New Roman"/>
+                <w:sz w:val="19"/>
+              </w:rPr>
+              <w:t>0.15 → 0.30</w:t>
+            </w:r>
+          </w:p>
+        </w:tc>
+        <w:tc>
+          <w:tcPr>
+            <w:tcW w:type="dxa" w:w="1520"/>
+          </w:tcPr>
+          <w:p>
+            <w:pPr>
+              <w:jc w:val="center"/>
+            </w:pPr>
+            <w:r/>
+            <w:r>
+              <w:rPr>
+                <w:rFonts w:ascii="Times New Roman" w:hAnsi="Times New Roman"/>
+                <w:sz w:val="19"/>
+              </w:rPr>
+              <w:t>No al 5%</w:t>
+            </w:r>
+          </w:p>
+        </w:tc>
+      </w:tr>
+    </w:tbl>
+    <w:p>
+      <w:pPr>
+        <w:spacing w:after="80"/>
+      </w:pPr>
+    </w:p>
+    <w:p>
+      <w:r>
+        <w:t xml:space="preserve">Antofagasta presenta un </w:t>
+      </w:r>
+      <w:r>
+        <w:rPr>
+          <w:b/>
+        </w:rPr>
+        <w:t>quiebre significativo</w:t>
+      </w:r>
+      <w:r>
+        <w:t xml:space="preserve"> en torno a mediados de 2007</w:t>
+      </w:r>
+    </w:p>
+    <w:p>
+      <w:r>
+        <w:t>(víspera de la crisis financiera), tras el cual su elasticidad-cobre **se duplica con</w:t>
+      </w:r>
+    </w:p>
+    <w:p>
+      <w:r>
+        <w:t>creces** (0.34 → 0.78): su integración al fundamento cuprífero se intensificó</w:t>
+      </w:r>
+    </w:p>
+    <w:p>
+      <w:r>
+        <w:t xml:space="preserve">estructuralmente. Pucobre, en cambio, </w:t>
+      </w:r>
+      <w:r>
+        <w:rPr>
+          <w:b/>
+        </w:rPr>
+        <w:t>no exhibe quiebre significativo</w:t>
+      </w:r>
+      <w:r>
+        <w:t>: su débil</w:t>
+      </w:r>
+    </w:p>
+    <w:p>
+      <w:r>
+        <w:t xml:space="preserve">transmisión contemporánea es </w:t>
+      </w:r>
+      <w:r>
+        <w:rPr>
+          <w:b/>
+        </w:rPr>
+        <w:t>estructuralmente estable</w:t>
+      </w:r>
+      <w:r>
+        <w:t>, no un artefacto de un</w:t>
+      </w:r>
+    </w:p>
+    <w:p>
+      <w:r>
+        <w:t>régimen particular. Esto refuerza H2/H5: la baja sensibilidad contemporánea de</w:t>
+      </w:r>
+    </w:p>
+    <w:p>
+      <w:r>
+        <w:t>Pucobre es una característica permanente de su microestructura (iliquidez), no un</w:t>
+      </w:r>
+    </w:p>
+    <w:p>
+      <w:r>
+        <w:t>fenómeno transitorio.</w:t>
+      </w:r>
+    </w:p>
+    <w:p>
+      <w:pPr>
+        <w:pStyle w:val="Heading3"/>
+      </w:pPr>
+      <w:r>
+        <w:t>6.14 Robustez de la iliquidez: medidas alternativas</w:t>
+      </w:r>
+    </w:p>
+    <w:p>
+      <w:r>
+        <w:t>Dado que el hallazgo central descansa sobre la iliquidez, se replica el contraste</w:t>
+      </w:r>
+    </w:p>
+    <w:p>
+      <w:r>
+        <w:t xml:space="preserve">transversal con </w:t>
+      </w:r>
+      <w:r>
+        <w:rPr>
+          <w:b/>
+        </w:rPr>
+        <w:t>cuatro proxies construidas con metodologías distintas</w:t>
+      </w:r>
+      <w:r>
+        <w:t xml:space="preserve"> —Amihud</w:t>
+      </w:r>
+    </w:p>
+    <w:p>
+      <w:r>
+        <w:t>(basada en volumen), porcentaje de días con retorno cero (Lesmond et al.), spread</w:t>
+      </w:r>
+    </w:p>
+    <w:p>
+      <w:r>
+        <w:t>implícito de Roll (basado en autocovarianza de retornos) y volumen medio en</w:t>
+      </w:r>
+    </w:p>
+    <w:p>
+      <w:r>
+        <w:t>USD-equivalente—:</w:t>
+      </w:r>
+    </w:p>
+    <w:tbl>
+      <w:tblPr>
+        <w:tblStyle w:val="LightGrid-Accent1"/>
+        <w:tblW w:type="auto" w:w="0"/>
+        <w:jc w:val="center"/>
+        <w:tblLook w:firstColumn="1" w:firstRow="1" w:lastColumn="0" w:lastRow="0" w:noHBand="0" w:noVBand="1" w:val="04A0"/>
+      </w:tblPr>
+      <w:tblGrid>
+        <w:gridCol w:w="2280"/>
+        <w:gridCol w:w="2280"/>
+        <w:gridCol w:w="2280"/>
+        <w:gridCol w:w="2280"/>
+      </w:tblGrid>
+      <w:tr>
+        <w:tc>
+          <w:tcPr>
+            <w:tcW w:type="dxa" w:w="2280"/>
+            <w:shd w:val="clear" w:fill="1B2A41"/>
+          </w:tcPr>
+          <w:p>
+            <w:pPr>
+              <w:jc w:val="center"/>
+            </w:pPr>
+            <w:r/>
+            <w:r>
+              <w:rPr>
+                <w:rFonts w:ascii="Times New Roman" w:hAnsi="Times New Roman"/>
+                <w:b/>
+                <w:color w:val="FFFFFF"/>
+                <w:sz w:val="19"/>
+              </w:rPr>
+              <w:t>Medida</w:t>
+            </w:r>
+          </w:p>
+        </w:tc>
+        <w:tc>
+          <w:tcPr>
+            <w:tcW w:type="dxa" w:w="2280"/>
+            <w:shd w:val="clear" w:fill="1B2A41"/>
+          </w:tcPr>
+          <w:p>
+            <w:pPr>
+              <w:jc w:val="center"/>
+            </w:pPr>
+            <w:r/>
+            <w:r>
+              <w:rPr>
+                <w:rFonts w:ascii="Times New Roman" w:hAnsi="Times New Roman"/>
+                <w:b/>
+                <w:color w:val="FFFFFF"/>
+                <w:sz w:val="19"/>
+              </w:rPr>
+              <w:t>Signo esperado</w:t>
+            </w:r>
+          </w:p>
+        </w:tc>
+        <w:tc>
+          <w:tcPr>
+            <w:tcW w:type="dxa" w:w="2280"/>
+            <w:shd w:val="clear" w:fill="1B2A41"/>
+          </w:tcPr>
+          <w:p>
+            <w:pPr>
+              <w:jc w:val="center"/>
+            </w:pPr>
+            <w:r/>
+            <w:r>
+              <w:rPr>
+                <w:rFonts w:ascii="Times New Roman" w:hAnsi="Times New Roman"/>
+                <w:b/>
+                <w:color w:val="FFFFFF"/>
+                <w:sz w:val="19"/>
+              </w:rPr>
+              <w:t>Spearman ρ con β-cobre</w:t>
+            </w:r>
+          </w:p>
+        </w:tc>
+        <w:tc>
+          <w:tcPr>
+            <w:tcW w:type="dxa" w:w="2280"/>
+            <w:shd w:val="clear" w:fill="1B2A41"/>
+          </w:tcPr>
+          <w:p>
+            <w:pPr>
+              <w:jc w:val="center"/>
+            </w:pPr>
+            <w:r/>
+            <w:r>
+              <w:rPr>
+                <w:rFonts w:ascii="Times New Roman" w:hAnsi="Times New Roman"/>
+                <w:b/>
+                <w:color w:val="FFFFFF"/>
+                <w:sz w:val="19"/>
+              </w:rPr>
+              <w:t>p</w:t>
+            </w:r>
+          </w:p>
+        </w:tc>
+      </w:tr>
+      <w:tr>
+        <w:tc>
+          <w:tcPr>
+            <w:tcW w:type="dxa" w:w="2280"/>
+          </w:tcPr>
+          <w:p>
+            <w:pPr>
+              <w:jc w:val="center"/>
+            </w:pPr>
+            <w:r/>
+            <w:r>
+              <w:rPr>
+                <w:rFonts w:ascii="Times New Roman" w:hAnsi="Times New Roman"/>
+                <w:sz w:val="19"/>
+              </w:rPr>
+              <w:t>% días retorno cero</w:t>
+            </w:r>
+          </w:p>
+        </w:tc>
+        <w:tc>
+          <w:tcPr>
+            <w:tcW w:type="dxa" w:w="2280"/>
+          </w:tcPr>
+          <w:p>
+            <w:pPr>
+              <w:jc w:val="center"/>
+            </w:pPr>
+            <w:r/>
+            <w:r>
+              <w:rPr>
+                <w:rFonts w:ascii="Times New Roman" w:hAnsi="Times New Roman"/>
+                <w:sz w:val="19"/>
+              </w:rPr>
+              <w:t>−</w:t>
+            </w:r>
+          </w:p>
+        </w:tc>
+        <w:tc>
+          <w:tcPr>
+            <w:tcW w:type="dxa" w:w="2280"/>
+          </w:tcPr>
+          <w:p>
+            <w:pPr>
+              <w:jc w:val="center"/>
+            </w:pPr>
+            <w:r/>
+            <w:r>
+              <w:rPr>
+                <w:rFonts w:ascii="Times New Roman" w:hAnsi="Times New Roman"/>
+                <w:sz w:val="19"/>
+              </w:rPr>
+              <w:t>−0.55</w:t>
+            </w:r>
+          </w:p>
+        </w:tc>
+        <w:tc>
+          <w:tcPr>
+            <w:tcW w:type="dxa" w:w="2280"/>
+          </w:tcPr>
+          <w:p>
+            <w:pPr>
+              <w:jc w:val="center"/>
+            </w:pPr>
+            <w:r/>
+            <w:r>
+              <w:rPr>
+                <w:rFonts w:ascii="Times New Roman" w:hAnsi="Times New Roman"/>
+                <w:sz w:val="19"/>
+              </w:rPr>
+              <w:t>0.16</w:t>
+            </w:r>
+          </w:p>
+        </w:tc>
+      </w:tr>
+      <w:tr>
+        <w:tc>
+          <w:tcPr>
+            <w:tcW w:type="dxa" w:w="2280"/>
+          </w:tcPr>
+          <w:p>
+            <w:pPr>
+              <w:jc w:val="center"/>
+            </w:pPr>
+            <w:r/>
+            <w:r>
+              <w:rPr>
+                <w:rFonts w:ascii="Times New Roman" w:hAnsi="Times New Roman"/>
+                <w:sz w:val="19"/>
+              </w:rPr>
+              <w:t>Spread de Roll</w:t>
+            </w:r>
+          </w:p>
+        </w:tc>
+        <w:tc>
+          <w:tcPr>
+            <w:tcW w:type="dxa" w:w="2280"/>
+          </w:tcPr>
+          <w:p>
+            <w:pPr>
+              <w:jc w:val="center"/>
+            </w:pPr>
+            <w:r/>
+            <w:r>
+              <w:rPr>
+                <w:rFonts w:ascii="Times New Roman" w:hAnsi="Times New Roman"/>
+                <w:sz w:val="19"/>
+              </w:rPr>
+              <w:t>−</w:t>
+            </w:r>
+          </w:p>
+        </w:tc>
+        <w:tc>
+          <w:tcPr>
+            <w:tcW w:type="dxa" w:w="2280"/>
+          </w:tcPr>
+          <w:p>
+            <w:pPr>
+              <w:jc w:val="center"/>
+            </w:pPr>
+            <w:r/>
+            <w:r>
+              <w:rPr>
+                <w:rFonts w:ascii="Times New Roman" w:hAnsi="Times New Roman"/>
+                <w:sz w:val="19"/>
+              </w:rPr>
+              <w:t>−0.40</w:t>
+            </w:r>
+          </w:p>
+        </w:tc>
+        <w:tc>
+          <w:tcPr>
+            <w:tcW w:type="dxa" w:w="2280"/>
+          </w:tcPr>
+          <w:p>
+            <w:pPr>
+              <w:jc w:val="center"/>
+            </w:pPr>
+            <w:r/>
+            <w:r>
+              <w:rPr>
+                <w:rFonts w:ascii="Times New Roman" w:hAnsi="Times New Roman"/>
+                <w:sz w:val="19"/>
+              </w:rPr>
+              <w:t>0.50</w:t>
+            </w:r>
+          </w:p>
+        </w:tc>
+      </w:tr>
+      <w:tr>
+        <w:tc>
+          <w:tcPr>
+            <w:tcW w:type="dxa" w:w="2280"/>
+          </w:tcPr>
+          <w:p>
+            <w:pPr>
+              <w:jc w:val="center"/>
+            </w:pPr>
+            <w:r/>
+            <w:r>
+              <w:rPr>
+                <w:rFonts w:ascii="Times New Roman" w:hAnsi="Times New Roman"/>
+                <w:sz w:val="19"/>
+              </w:rPr>
+              <w:t>Amihud</w:t>
+            </w:r>
+          </w:p>
+        </w:tc>
+        <w:tc>
+          <w:tcPr>
+            <w:tcW w:type="dxa" w:w="2280"/>
+          </w:tcPr>
+          <w:p>
+            <w:pPr>
+              <w:jc w:val="center"/>
+            </w:pPr>
+            <w:r/>
+            <w:r>
+              <w:rPr>
+                <w:rFonts w:ascii="Times New Roman" w:hAnsi="Times New Roman"/>
+                <w:sz w:val="19"/>
+              </w:rPr>
+              <w:t>−</w:t>
+            </w:r>
+          </w:p>
+        </w:tc>
+        <w:tc>
+          <w:tcPr>
+            <w:tcW w:type="dxa" w:w="2280"/>
+          </w:tcPr>
+          <w:p>
+            <w:pPr>
+              <w:jc w:val="center"/>
+            </w:pPr>
+            <w:r/>
+            <w:r>
+              <w:rPr>
+                <w:rFonts w:ascii="Times New Roman" w:hAnsi="Times New Roman"/>
+                <w:sz w:val="19"/>
+              </w:rPr>
+              <w:t>−0.07</w:t>
+            </w:r>
+          </w:p>
+        </w:tc>
+        <w:tc>
+          <w:tcPr>
+            <w:tcW w:type="dxa" w:w="2280"/>
+          </w:tcPr>
+          <w:p>
+            <w:pPr>
+              <w:jc w:val="center"/>
+            </w:pPr>
+            <w:r/>
+            <w:r>
+              <w:rPr>
+                <w:rFonts w:ascii="Times New Roman" w:hAnsi="Times New Roman"/>
+                <w:sz w:val="19"/>
+              </w:rPr>
+              <w:t>0.88</w:t>
+            </w:r>
+          </w:p>
+        </w:tc>
+      </w:tr>
+      <w:tr>
+        <w:tc>
+          <w:tcPr>
+            <w:tcW w:type="dxa" w:w="2280"/>
+          </w:tcPr>
+          <w:p>
+            <w:pPr>
+              <w:jc w:val="center"/>
+            </w:pPr>
+            <w:r/>
+            <w:r>
+              <w:rPr>
+                <w:rFonts w:ascii="Times New Roman" w:hAnsi="Times New Roman"/>
+                <w:sz w:val="19"/>
+              </w:rPr>
+              <w:t>Volumen medio (USD)</w:t>
+            </w:r>
+          </w:p>
+        </w:tc>
+        <w:tc>
+          <w:tcPr>
+            <w:tcW w:type="dxa" w:w="2280"/>
+          </w:tcPr>
+          <w:p>
+            <w:pPr>
+              <w:jc w:val="center"/>
+            </w:pPr>
+            <w:r/>
+            <w:r>
+              <w:rPr>
+                <w:rFonts w:ascii="Times New Roman" w:hAnsi="Times New Roman"/>
+                <w:sz w:val="19"/>
+              </w:rPr>
+              <w:t>+</w:t>
+            </w:r>
+          </w:p>
+        </w:tc>
+        <w:tc>
+          <w:tcPr>
+            <w:tcW w:type="dxa" w:w="2280"/>
+          </w:tcPr>
+          <w:p>
+            <w:pPr>
+              <w:jc w:val="center"/>
+            </w:pPr>
+            <w:r/>
+            <w:r>
+              <w:rPr>
+                <w:rFonts w:ascii="Times New Roman" w:hAnsi="Times New Roman"/>
+                <w:sz w:val="19"/>
+              </w:rPr>
+              <w:t>+0.33</w:t>
+            </w:r>
+          </w:p>
+        </w:tc>
+        <w:tc>
+          <w:tcPr>
+            <w:tcW w:type="dxa" w:w="2280"/>
+          </w:tcPr>
+          <w:p>
+            <w:pPr>
+              <w:jc w:val="center"/>
+            </w:pPr>
+            <w:r/>
+            <w:r>
+              <w:rPr>
+                <w:rFonts w:ascii="Times New Roman" w:hAnsi="Times New Roman"/>
+                <w:sz w:val="19"/>
+              </w:rPr>
+              <w:t>0.42</w:t>
+            </w:r>
+          </w:p>
+        </w:tc>
+      </w:tr>
+    </w:tbl>
+    <w:p>
+      <w:pPr>
+        <w:spacing w:after="80"/>
+      </w:pPr>
+    </w:p>
+    <w:p>
+      <w:r>
+        <w:t xml:space="preserve">Las cuatro medidas apuntan en la </w:t>
+      </w:r>
+      <w:r>
+        <w:rPr>
+          <w:b/>
+        </w:rPr>
+        <w:t>dirección predicha</w:t>
+      </w:r>
+      <w:r>
+        <w:t xml:space="preserve"> (mayor iliquidez → menor</w:t>
+      </w:r>
+    </w:p>
+    <w:p>
+      <w:r>
+        <w:t>transmisión contemporánea; mayor volumen → mayor transmisión), aunque ninguna alcanza</w:t>
+      </w:r>
+    </w:p>
+    <w:p>
+      <w:r>
+        <w:t xml:space="preserve">significancia individual con N=8 (baja potencia). La </w:t>
+      </w:r>
+      <w:r>
+        <w:rPr>
+          <w:b/>
+        </w:rPr>
+        <w:t>consistencia de signos</w:t>
+      </w:r>
+      <w:r>
+        <w:t xml:space="preserve"> entre</w:t>
+      </w:r>
+    </w:p>
+    <w:p>
+      <w:r>
+        <w:t>proxies metodológicamente independientes robustece la conclusión: el hallazgo no</w:t>
+      </w:r>
+    </w:p>
+    <w:p>
+      <w:r>
+        <w:t>depende del estimador de Amihud. (El spread de Roll resulta indefinido para Pucobre,</w:t>
+      </w:r>
+    </w:p>
+    <w:p>
+      <w:r>
+        <w:t>CAP y SQM —autocovarianza positiva por la masa de retornos cero—, lo que confirma que</w:t>
+      </w:r>
+    </w:p>
+    <w:p>
+      <w:r>
+        <w:t xml:space="preserve">el </w:t>
+      </w:r>
+      <w:r>
+        <w:rPr>
+          <w:b/>
+        </w:rPr>
+        <w:t>porcentaje de días con retorno cero</w:t>
+      </w:r>
+      <w:r>
+        <w:t xml:space="preserve"> es la proxy preferida para los activos más</w:t>
+      </w:r>
+    </w:p>
+    <w:p>
+      <w:r>
+        <w:t>ilíquidos, en línea con Lesmond et al.)</w:t>
+      </w:r>
+    </w:p>
+    <w:p>
+      <w:pPr>
+        <w:pStyle w:val="Heading3"/>
+      </w:pPr>
+      <w:r>
+        <w:t>6.15 Validación fuera de muestra (Clark-West)</w:t>
+      </w:r>
+    </w:p>
+    <w:p>
+      <w:r>
+        <w:t xml:space="preserve">Como prueba </w:t>
+      </w:r>
+      <w:r>
+        <w:rPr>
+          <w:b/>
+        </w:rPr>
+        <w:t>predictiva e independiente</w:t>
+      </w:r>
+      <w:r>
+        <w:t xml:space="preserve"> de la transmisión diferida (H5), se evalúa</w:t>
+      </w:r>
+    </w:p>
+    <w:p>
+      <w:r>
+        <w:t xml:space="preserve">si el cobre </w:t>
+      </w:r>
+      <w:r>
+        <w:rPr>
+          <w:b/>
+        </w:rPr>
+        <w:t>rezagado</w:t>
+      </w:r>
+      <w:r>
+        <w:t xml:space="preserve"> mejora la predicción fuera de muestra del retorno, mediante</w:t>
+      </w:r>
+    </w:p>
+    <w:p>
+      <w:r>
+        <w:t>un esquema recursivo (ventana expansiva desde el 50% de la muestra) que compara un</w:t>
+      </w:r>
+    </w:p>
+    <w:p>
+      <w:r>
+        <w:t>benchmark AR(1) anidado con un modelo AR(1) + cobre rezagado (lags 1–2), usando el</w:t>
+      </w:r>
+    </w:p>
+    <w:p>
+      <w:r>
+        <w:t>R² fuera de muestra (Campbell-Thompson) y el test de Clark-West:</w:t>
+      </w:r>
+    </w:p>
+    <w:tbl>
+      <w:tblPr>
+        <w:tblStyle w:val="LightGrid-Accent1"/>
+        <w:tblW w:type="auto" w:w="0"/>
+        <w:jc w:val="center"/>
+        <w:tblLook w:firstColumn="1" w:firstRow="1" w:lastColumn="0" w:lastRow="0" w:noHBand="0" w:noVBand="1" w:val="04A0"/>
+      </w:tblPr>
+      <w:tblGrid>
+        <w:gridCol w:w="1824"/>
+        <w:gridCol w:w="1824"/>
+        <w:gridCol w:w="1824"/>
+        <w:gridCol w:w="1824"/>
+        <w:gridCol w:w="1824"/>
+      </w:tblGrid>
+      <w:tr>
+        <w:tc>
+          <w:tcPr>
+            <w:tcW w:type="dxa" w:w="1824"/>
+            <w:shd w:val="clear" w:fill="1B2A41"/>
+          </w:tcPr>
+          <w:p>
+            <w:pPr>
+              <w:jc w:val="center"/>
+            </w:pPr>
+            <w:r/>
+            <w:r>
+              <w:rPr>
+                <w:rFonts w:ascii="Times New Roman" w:hAnsi="Times New Roman"/>
+                <w:b/>
+                <w:color w:val="FFFFFF"/>
+                <w:sz w:val="19"/>
+              </w:rPr>
+              <w:t>Activo</w:t>
+            </w:r>
+          </w:p>
+        </w:tc>
+        <w:tc>
+          <w:tcPr>
+            <w:tcW w:type="dxa" w:w="1824"/>
+            <w:shd w:val="clear" w:fill="1B2A41"/>
+          </w:tcPr>
+          <w:p>
+            <w:pPr>
+              <w:jc w:val="center"/>
+            </w:pPr>
+            <w:r/>
+            <w:r>
+              <w:rPr>
+                <w:rFonts w:ascii="Times New Roman" w:hAnsi="Times New Roman"/>
+                <w:b/>
+                <w:color w:val="FFFFFF"/>
+                <w:sz w:val="19"/>
+              </w:rPr>
+              <w:t>R² OOS (%)</w:t>
+            </w:r>
+          </w:p>
+        </w:tc>
+        <w:tc>
+          <w:tcPr>
+            <w:tcW w:type="dxa" w:w="1824"/>
+            <w:shd w:val="clear" w:fill="1B2A41"/>
+          </w:tcPr>
+          <w:p>
+            <w:pPr>
+              <w:jc w:val="center"/>
+            </w:pPr>
+            <w:r/>
+            <w:r>
+              <w:rPr>
+                <w:rFonts w:ascii="Times New Roman" w:hAnsi="Times New Roman"/>
+                <w:b/>
+                <w:color w:val="FFFFFF"/>
+                <w:sz w:val="19"/>
+              </w:rPr>
+              <w:t>Clark-West t</w:t>
+            </w:r>
+          </w:p>
+        </w:tc>
+        <w:tc>
+          <w:tcPr>
+            <w:tcW w:type="dxa" w:w="1824"/>
+            <w:shd w:val="clear" w:fill="1B2A41"/>
+          </w:tcPr>
+          <w:p>
+            <w:pPr>
+              <w:jc w:val="center"/>
+            </w:pPr>
+            <w:r/>
+            <w:r>
+              <w:rPr>
+                <w:rFonts w:ascii="Times New Roman" w:hAnsi="Times New Roman"/>
+                <w:b/>
+                <w:color w:val="FFFFFF"/>
+                <w:sz w:val="19"/>
+              </w:rPr>
+              <w:t>p</w:t>
+            </w:r>
+          </w:p>
+        </w:tc>
+        <w:tc>
+          <w:tcPr>
+            <w:tcW w:type="dxa" w:w="1824"/>
+            <w:shd w:val="clear" w:fill="1B2A41"/>
+          </w:tcPr>
+          <w:p>
+            <w:pPr>
+              <w:jc w:val="center"/>
+            </w:pPr>
+            <w:r/>
+            <w:r>
+              <w:rPr>
+                <w:rFonts w:ascii="Times New Roman" w:hAnsi="Times New Roman"/>
+                <w:b/>
+                <w:color w:val="FFFFFF"/>
+                <w:sz w:val="19"/>
+              </w:rPr>
+              <w:t>¿el cobre rezagado mejora?</w:t>
+            </w:r>
+          </w:p>
+        </w:tc>
+      </w:tr>
+      <w:tr>
+        <w:tc>
+          <w:tcPr>
+            <w:tcW w:type="dxa" w:w="1824"/>
+          </w:tcPr>
+          <w:p>
+            <w:pPr>
+              <w:jc w:val="center"/>
+            </w:pPr>
+            <w:r/>
+            <w:r>
+              <w:rPr>
+                <w:rFonts w:ascii="Times New Roman" w:hAnsi="Times New Roman"/>
+                <w:sz w:val="19"/>
+              </w:rPr>
+              <w:t>PUCOBRE.SN</w:t>
+            </w:r>
+          </w:p>
+        </w:tc>
+        <w:tc>
+          <w:tcPr>
+            <w:tcW w:type="dxa" w:w="1824"/>
+          </w:tcPr>
+          <w:p>
+            <w:pPr>
+              <w:jc w:val="center"/>
+            </w:pPr>
+            <w:r/>
+            <w:r>
+              <w:rPr>
+                <w:rFonts w:ascii="Times New Roman" w:hAnsi="Times New Roman"/>
+                <w:sz w:val="19"/>
+              </w:rPr>
+              <w:t>+0.24</w:t>
+            </w:r>
+          </w:p>
+        </w:tc>
+        <w:tc>
+          <w:tcPr>
+            <w:tcW w:type="dxa" w:w="1824"/>
+          </w:tcPr>
+          <w:p>
+            <w:pPr>
+              <w:jc w:val="center"/>
+            </w:pPr>
+            <w:r/>
+            <w:r>
+              <w:rPr>
+                <w:rFonts w:ascii="Times New Roman" w:hAnsi="Times New Roman"/>
+                <w:sz w:val="19"/>
+              </w:rPr>
+              <w:t>2.64</w:t>
+            </w:r>
+          </w:p>
+        </w:tc>
+        <w:tc>
+          <w:tcPr>
+            <w:tcW w:type="dxa" w:w="1824"/>
+          </w:tcPr>
+          <w:p>
+            <w:pPr>
+              <w:jc w:val="center"/>
+            </w:pPr>
+            <w:r/>
+            <w:r>
+              <w:rPr>
+                <w:rFonts w:ascii="Times New Roman" w:hAnsi="Times New Roman"/>
+                <w:sz w:val="19"/>
+              </w:rPr>
+              <w:t>0.004</w:t>
+            </w:r>
+          </w:p>
+        </w:tc>
+        <w:tc>
+          <w:tcPr>
+            <w:tcW w:type="dxa" w:w="1824"/>
+          </w:tcPr>
+          <w:p>
+            <w:pPr>
+              <w:jc w:val="center"/>
+            </w:pPr>
+            <w:r/>
+            <w:r>
+              <w:rPr>
+                <w:rFonts w:ascii="Times New Roman" w:hAnsi="Times New Roman"/>
+                <w:sz w:val="19"/>
+              </w:rPr>
+              <w:t>Sí</w:t>
+            </w:r>
+          </w:p>
+        </w:tc>
+      </w:tr>
+      <w:tr>
+        <w:tc>
+          <w:tcPr>
+            <w:tcW w:type="dxa" w:w="1824"/>
+          </w:tcPr>
+          <w:p>
+            <w:pPr>
+              <w:jc w:val="center"/>
+            </w:pPr>
+            <w:r/>
+            <w:r>
+              <w:rPr>
+                <w:rFonts w:ascii="Times New Roman" w:hAnsi="Times New Roman"/>
+                <w:sz w:val="19"/>
+              </w:rPr>
+              <w:t>ANTO.L</w:t>
+            </w:r>
+          </w:p>
+        </w:tc>
+        <w:tc>
+          <w:tcPr>
+            <w:tcW w:type="dxa" w:w="1824"/>
+          </w:tcPr>
+          <w:p>
+            <w:pPr>
+              <w:jc w:val="center"/>
+            </w:pPr>
+            <w:r/>
+            <w:r>
+              <w:rPr>
+                <w:rFonts w:ascii="Times New Roman" w:hAnsi="Times New Roman"/>
+                <w:sz w:val="19"/>
+              </w:rPr>
+              <w:t>+0.20</w:t>
+            </w:r>
+          </w:p>
+        </w:tc>
+        <w:tc>
+          <w:tcPr>
+            <w:tcW w:type="dxa" w:w="1824"/>
+          </w:tcPr>
+          <w:p>
+            <w:pPr>
+              <w:jc w:val="center"/>
+            </w:pPr>
+            <w:r/>
+            <w:r>
+              <w:rPr>
+                <w:rFonts w:ascii="Times New Roman" w:hAnsi="Times New Roman"/>
+                <w:sz w:val="19"/>
+              </w:rPr>
+              <w:t>2.45</w:t>
+            </w:r>
+          </w:p>
+        </w:tc>
+        <w:tc>
+          <w:tcPr>
+            <w:tcW w:type="dxa" w:w="1824"/>
+          </w:tcPr>
+          <w:p>
+            <w:pPr>
+              <w:jc w:val="center"/>
+            </w:pPr>
+            <w:r/>
+            <w:r>
+              <w:rPr>
+                <w:rFonts w:ascii="Times New Roman" w:hAnsi="Times New Roman"/>
+                <w:sz w:val="19"/>
+              </w:rPr>
+              <w:t>0.007</w:t>
+            </w:r>
+          </w:p>
+        </w:tc>
+        <w:tc>
+          <w:tcPr>
+            <w:tcW w:type="dxa" w:w="1824"/>
+          </w:tcPr>
+          <w:p>
+            <w:pPr>
+              <w:jc w:val="center"/>
+            </w:pPr>
+            <w:r/>
+            <w:r>
+              <w:rPr>
+                <w:rFonts w:ascii="Times New Roman" w:hAnsi="Times New Roman"/>
+                <w:sz w:val="19"/>
+              </w:rPr>
+              <w:t>Sí</w:t>
+            </w:r>
+          </w:p>
+        </w:tc>
+      </w:tr>
+      <w:tr>
+        <w:tc>
+          <w:tcPr>
+            <w:tcW w:type="dxa" w:w="1824"/>
+          </w:tcPr>
+          <w:p>
+            <w:pPr>
+              <w:jc w:val="center"/>
+            </w:pPr>
+            <w:r/>
+            <w:r>
+              <w:rPr>
+                <w:rFonts w:ascii="Times New Roman" w:hAnsi="Times New Roman"/>
+                <w:sz w:val="19"/>
+              </w:rPr>
+              <w:t>CAP.SN</w:t>
+            </w:r>
+          </w:p>
+        </w:tc>
+        <w:tc>
+          <w:tcPr>
+            <w:tcW w:type="dxa" w:w="1824"/>
+          </w:tcPr>
+          <w:p>
+            <w:pPr>
+              <w:jc w:val="center"/>
+            </w:pPr>
+            <w:r/>
+            <w:r>
+              <w:rPr>
+                <w:rFonts w:ascii="Times New Roman" w:hAnsi="Times New Roman"/>
+                <w:sz w:val="19"/>
+              </w:rPr>
+              <w:t>+0.32</w:t>
+            </w:r>
+          </w:p>
+        </w:tc>
+        <w:tc>
+          <w:tcPr>
+            <w:tcW w:type="dxa" w:w="1824"/>
+          </w:tcPr>
+          <w:p>
+            <w:pPr>
+              <w:jc w:val="center"/>
+            </w:pPr>
+            <w:r/>
+            <w:r>
+              <w:rPr>
+                <w:rFonts w:ascii="Times New Roman" w:hAnsi="Times New Roman"/>
+                <w:sz w:val="19"/>
+              </w:rPr>
+              <w:t>2.53</w:t>
+            </w:r>
+          </w:p>
+        </w:tc>
+        <w:tc>
+          <w:tcPr>
+            <w:tcW w:type="dxa" w:w="1824"/>
+          </w:tcPr>
+          <w:p>
+            <w:pPr>
+              <w:jc w:val="center"/>
+            </w:pPr>
+            <w:r/>
+            <w:r>
+              <w:rPr>
+                <w:rFonts w:ascii="Times New Roman" w:hAnsi="Times New Roman"/>
+                <w:sz w:val="19"/>
+              </w:rPr>
+              <w:t>0.006</w:t>
+            </w:r>
+          </w:p>
+        </w:tc>
+        <w:tc>
+          <w:tcPr>
+            <w:tcW w:type="dxa" w:w="1824"/>
+          </w:tcPr>
+          <w:p>
+            <w:pPr>
+              <w:jc w:val="center"/>
+            </w:pPr>
+            <w:r/>
+            <w:r>
+              <w:rPr>
+                <w:rFonts w:ascii="Times New Roman" w:hAnsi="Times New Roman"/>
+                <w:sz w:val="19"/>
+              </w:rPr>
+              <w:t>Sí</w:t>
+            </w:r>
+          </w:p>
+        </w:tc>
+      </w:tr>
+      <w:tr>
+        <w:tc>
+          <w:tcPr>
+            <w:tcW w:type="dxa" w:w="1824"/>
+          </w:tcPr>
+          <w:p>
+            <w:pPr>
+              <w:jc w:val="center"/>
+            </w:pPr>
+            <w:r/>
+            <w:r>
+              <w:rPr>
+                <w:rFonts w:ascii="Times New Roman" w:hAnsi="Times New Roman"/>
+                <w:sz w:val="19"/>
+              </w:rPr>
+              <w:t>SQM-B.SN (litio)</w:t>
+            </w:r>
+          </w:p>
+        </w:tc>
+        <w:tc>
+          <w:tcPr>
+            <w:tcW w:type="dxa" w:w="1824"/>
+          </w:tcPr>
+          <w:p>
+            <w:pPr>
+              <w:jc w:val="center"/>
+            </w:pPr>
+            <w:r/>
+            <w:r>
+              <w:rPr>
+                <w:rFonts w:ascii="Times New Roman" w:hAnsi="Times New Roman"/>
+                <w:sz w:val="19"/>
+              </w:rPr>
+              <w:t>−0.02</w:t>
+            </w:r>
+          </w:p>
+        </w:tc>
+        <w:tc>
+          <w:tcPr>
+            <w:tcW w:type="dxa" w:w="1824"/>
+          </w:tcPr>
+          <w:p>
+            <w:pPr>
+              <w:jc w:val="center"/>
+            </w:pPr>
+            <w:r/>
+            <w:r>
+              <w:rPr>
+                <w:rFonts w:ascii="Times New Roman" w:hAnsi="Times New Roman"/>
+                <w:sz w:val="19"/>
+              </w:rPr>
+              <w:t>−0.45</w:t>
+            </w:r>
+          </w:p>
+        </w:tc>
+        <w:tc>
+          <w:tcPr>
+            <w:tcW w:type="dxa" w:w="1824"/>
+          </w:tcPr>
+          <w:p>
+            <w:pPr>
+              <w:jc w:val="center"/>
+            </w:pPr>
+            <w:r/>
+            <w:r>
+              <w:rPr>
+                <w:rFonts w:ascii="Times New Roman" w:hAnsi="Times New Roman"/>
+                <w:sz w:val="19"/>
+              </w:rPr>
+              <w:t>0.68</w:t>
+            </w:r>
+          </w:p>
+        </w:tc>
+        <w:tc>
+          <w:tcPr>
+            <w:tcW w:type="dxa" w:w="1824"/>
+          </w:tcPr>
+          <w:p>
+            <w:pPr>
+              <w:jc w:val="center"/>
+            </w:pPr>
+            <w:r/>
+            <w:r>
+              <w:rPr>
+                <w:rFonts w:ascii="Times New Roman" w:hAnsi="Times New Roman"/>
+                <w:sz w:val="19"/>
+              </w:rPr>
+              <w:t>No (placebo)</w:t>
+            </w:r>
+          </w:p>
+        </w:tc>
+      </w:tr>
+    </w:tbl>
+    <w:p>
+      <w:pPr>
+        <w:spacing w:after="80"/>
+      </w:pPr>
+    </w:p>
+    <w:p>
+      <w:r>
+        <w:t xml:space="preserve">El cobre </w:t>
+      </w:r>
+      <w:r>
+        <w:rPr>
+          <w:b/>
+        </w:rPr>
+        <w:t>rezagado</w:t>
+      </w:r>
+      <w:r>
+        <w:t xml:space="preserve"> tiene poder predictivo fuera de muestra para Pucobre —de hecho</w:t>
+      </w:r>
+    </w:p>
+    <w:p>
+      <w:r/>
+      <w:r>
+        <w:rPr>
+          <w:b/>
+        </w:rPr>
+        <w:t>mayor</w:t>
+      </w:r>
+      <w:r>
+        <w:t xml:space="preserve"> que para Antofagasta—, exactamente lo que predice la transmisión diferida:</w:t>
+      </w:r>
+    </w:p>
+    <w:p>
+      <w:r>
+        <w:t>en el activo líquido el cobre ya está incorporado y el rezago aporta poco, mientras</w:t>
+      </w:r>
+    </w:p>
+    <w:p>
+      <w:r>
+        <w:t xml:space="preserve">que en el ilíquido el rezago captura la incorporación tardía. El </w:t>
+      </w:r>
+      <w:r>
+        <w:rPr>
+          <w:b/>
+        </w:rPr>
+        <w:t>placebo</w:t>
+      </w:r>
+      <w:r>
+        <w:t xml:space="preserve"> es nítido:</w:t>
+      </w:r>
+    </w:p>
+    <w:p>
+      <w:r>
+        <w:t>SQM (litio, no cobre) no muestra predictibilidad por cobre rezagado (p=0.68),</w:t>
+      </w:r>
+    </w:p>
+    <w:p>
+      <w:r>
+        <w:t>descartando que el resultado sea espurio. Esta es una confirmación de H5 por una vía</w:t>
+      </w:r>
+    </w:p>
+    <w:p>
+      <w:r>
+        <w:t>metodológicamente distinta a todo el resto del análisis.</w:t>
+      </w:r>
+    </w:p>
+    <w:p>
+      <w:pPr>
+        <w:pStyle w:val="Heading3"/>
+      </w:pPr>
+      <w:r>
+        <w:t>6.16 Síntesis de verificación de hipótesis</w:t>
       </w:r>
     </w:p>
     <w:tbl>
@@ -10371,6 +12440,158 @@
         <w:pStyle w:val="Heading3"/>
       </w:pPr>
       <w:r>
+        <w:t>7.1bis Significancia económica de las magnitudes</w:t>
+      </w:r>
+    </w:p>
+    <w:p>
+      <w:r>
+        <w:t>Más allá de la significancia estadística, las magnitudes tienen una lectura</w:t>
+      </w:r>
+    </w:p>
+    <w:p>
+      <w:r>
+        <w:t xml:space="preserve">económica concreta. Una elasticidad-cobre contemporánea de </w:t>
+      </w:r>
+      <w:r>
+        <w:rPr>
+          <w:b/>
+        </w:rPr>
+        <w:t>0.70</w:t>
+      </w:r>
+      <w:r>
+        <w:t xml:space="preserve"> para Antofagasta</w:t>
+      </w:r>
+    </w:p>
+    <w:p>
+      <w:r>
+        <w:t xml:space="preserve">implica que un movimiento de </w:t>
+      </w:r>
+      <w:r>
+        <w:rPr>
+          <w:b/>
+        </w:rPr>
+        <w:t>+10%</w:t>
+      </w:r>
+      <w:r>
+        <w:t xml:space="preserve"> en el precio del cobre se asocia, el mismo día,</w:t>
+      </w:r>
+    </w:p>
+    <w:p>
+      <w:r>
+        <w:t xml:space="preserve">con un retorno de </w:t>
+      </w:r>
+      <w:r>
+        <w:rPr>
+          <w:b/>
+        </w:rPr>
+        <w:t>≈+7%</w:t>
+      </w:r>
+      <w:r>
+        <w:t xml:space="preserve"> de la acción —coherente con el apalancamiento operativo de</w:t>
+      </w:r>
+    </w:p>
+    <w:p>
+      <w:r>
+        <w:t xml:space="preserve">un pure-play (§2.5)—. Para Pucobre, ese mismo shock de +10% genera apenas </w:t>
+      </w:r>
+      <w:r>
+        <w:rPr>
+          <w:b/>
+        </w:rPr>
+        <w:t>≈+0.9%</w:t>
+      </w:r>
+      <w:r/>
+    </w:p>
+    <w:p>
+      <w:r>
+        <w:t xml:space="preserve">el primer día, pero </w:t>
+      </w:r>
+      <w:r>
+        <w:rPr>
+          <w:b/>
+        </w:rPr>
+        <w:t>≈+6%</w:t>
+      </w:r>
+      <w:r>
+        <w:t xml:space="preserve"> acumulado al cabo de un mes y </w:t>
+      </w:r>
+      <w:r>
+        <w:rPr>
+          <w:b/>
+        </w:rPr>
+        <w:t>≈+7.5%</w:t>
+      </w:r>
+      <w:r>
+        <w:t xml:space="preserve"> en el equilibrio</w:t>
+      </w:r>
+    </w:p>
+    <w:p>
+      <w:r>
+        <w:t>de largo plazo. Para un inversionista, la implicancia es operativa: medir la</w:t>
+      </w:r>
+    </w:p>
+    <w:p>
+      <w:r>
+        <w:t xml:space="preserve">exposición de Pucobre al cobre con una beta </w:t>
+      </w:r>
+      <w:r>
+        <w:rPr>
+          <w:b/>
+        </w:rPr>
+        <w:t>diaria</w:t>
+      </w:r>
+      <w:r>
+        <w:t xml:space="preserve"> subestima su riesgo real en un</w:t>
+      </w:r>
+    </w:p>
+    <w:p>
+      <w:r>
+        <w:t xml:space="preserve">factor cercano a </w:t>
+      </w:r>
+      <w:r>
+        <w:rPr>
+          <w:b/>
+        </w:rPr>
+        <w:t>ocho</w:t>
+      </w:r>
+      <w:r>
+        <w:t xml:space="preserve"> (0.09 vs 0.75); la exposición sólo se aprecia correctamente</w:t>
+      </w:r>
+    </w:p>
+    <w:p>
+      <w:r>
+        <w:t>a horizontes mensuales o superiores. Para un emisor pequeño, el resultado cuantifica</w:t>
+      </w:r>
+    </w:p>
+    <w:p>
+      <w:r>
+        <w:t xml:space="preserve">un </w:t>
+      </w:r>
+      <w:r>
+        <w:rPr>
+          <w:b/>
+        </w:rPr>
+        <w:t>costo de iliquidez</w:t>
+      </w:r>
+      <w:r>
+        <w:t>: el mercado tarda en reflejar las mejoras de su fundamento,</w:t>
+      </w:r>
+    </w:p>
+    <w:p>
+      <w:r>
+        <w:t>lo que se traduce en mayor costo de capital y menor utilidad de la acción como</w:t>
+      </w:r>
+    </w:p>
+    <w:p>
+      <w:r>
+        <w:t>instrumento de cobertura del riesgo-cobre en el corto plazo.</w:t>
+      </w:r>
+    </w:p>
+    <w:p>
+      <w:pPr>
+        <w:pStyle w:val="Heading3"/>
+      </w:pPr>
+      <w:r>
         <w:t>7.2bis Implicaciones para la eficiencia de mercado</w:t>
       </w:r>
     </w:p>
@@ -11031,7 +13252,150 @@
     </w:p>
     <w:p>
       <w:r>
-        <w:t>Raíces unitarias y quiebres: Dickey &amp; Fuller (1979); Phillips &amp; Perron (1988); Kwiatkowski, Phillips, Schmidt &amp; Shin (1992, KPSS); Zivot &amp; Andrews (1992).</w:t>
+        <w:t>Raíces unitarias y quiebres: Dickey &amp; Fuller (1979); Phillips &amp; Perron (1988); Kwiatkowski, Phillips, Schmidt &amp; Shin (1992, KPSS); Zivot &amp; Andrews (1992); Andrews (1993, sup-tests de quiebre); Bai &amp; Perron (2003, quiebres múltiples).</w:t>
+      </w:r>
+    </w:p>
+    <w:p>
+      <w:r>
+        <w:t>Evidencia empírica reciente (commodities, cobre, liquidez):</w:t>
+      </w:r>
+    </w:p>
+    <w:p>
+      <w:pPr>
+        <w:pStyle w:val="ListBullet"/>
+      </w:pPr>
+      <w:r>
+        <w:t>Mendiola, A., Chávez-Bedoya, L., &amp; Wallenstein, T. (2022). Analyzing the reaction of mining stocks to the development of copper prices. Emerging Markets Finance and Trade, 58(1), 244–266. https://doi.org/10.1080/1540496X.2019.1703103</w:t>
+      </w:r>
+    </w:p>
+    <w:p>
+      <w:pPr>
+        <w:pStyle w:val="ListBullet"/>
+      </w:pPr>
+      <w:r>
+        <w:t>Díaz, J. D., Hansen, E., &amp; Cabrera, G. (2021). Economic drivers of commodity volatility: the case of copper. Resources Policy, 73, 102224. https://doi.org/10.1016/j.resourpol.2021.102224</w:t>
+      </w:r>
+    </w:p>
+    <w:p>
+      <w:pPr>
+        <w:pStyle w:val="ListBullet"/>
+      </w:pPr>
+      <w:r>
+        <w:t>Gorton, G., &amp; Rouwenhorst, K. G. (2006). Facts and fantasies about commodity futures. Financial Analysts Journal, 62(2), 47–68. https://doi.org/10.2469/faj.v62.n2.4083</w:t>
+      </w:r>
+    </w:p>
+    <w:p>
+      <w:pPr>
+        <w:pStyle w:val="ListBullet"/>
+      </w:pPr>
+      <w:r>
+        <w:t>Kilian, L., &amp; Park, C. (2009). The impact of oil price shocks on the U.S. stock market. International Economic Review, 50(4), 1267–1287. https://doi.org/10.1111/j.1468-2354.2009.00568.x</w:t>
+      </w:r>
+    </w:p>
+    <w:p>
+      <w:pPr>
+        <w:pStyle w:val="ListBullet"/>
+      </w:pPr>
+      <w:r>
+        <w:t>Cashin, P., McDermott, C. J., &amp; Scott, A. (2002). Booms and slumps in world commodity prices. Journal of Development Economics, 69(1), 277–296. https://doi.org/10.1016/S0304-3878(02)00062-7</w:t>
+      </w:r>
+    </w:p>
+    <w:p>
+      <w:pPr>
+        <w:pStyle w:val="ListBullet"/>
+      </w:pPr>
+      <w:r>
+        <w:t>Bekaert, G., Harvey, C. R., &amp; Lundblad, C. (2007). Liquidity and expected returns: lessons from emerging markets. Review of Financial Studies, 20(6), 1783–1831. https://doi.org/10.1093/rfs/hhm030</w:t>
+      </w:r>
+    </w:p>
+    <w:p>
+      <w:pPr>
+        <w:pStyle w:val="ListBullet"/>
+      </w:pPr>
+      <w:r>
+        <w:t>Amihud, Y., Hameed, A., Kang, W., &amp; Zhang, H. (2015). The illiquidity premium: international evidence. Journal of Financial Economics, 117(2), 350–368. https://doi.org/10.1016/j.jfineco.2015.04.005</w:t>
+      </w:r>
+    </w:p>
+    <w:p>
+      <w:pPr>
+        <w:pStyle w:val="ListBullet"/>
+      </w:pPr>
+      <w:r>
+        <w:t>Cunado, J., &amp; Pérez de Gracia, F. (2014). Oil price shocks and stock market returns: evidence for some European countries. Energy Economics, 42, 365–377. https://doi.org/10.1016/j.eneco.2013.10.017</w:t>
+      </w:r>
+    </w:p>
+    <w:p>
+      <w:pPr>
+        <w:pStyle w:val="ListBullet"/>
+      </w:pPr>
+      <w:r>
+        <w:t>Jawadi, F., Arouri, M. E. H., &amp; Million, N. (2009). Stock market integration in the Latin American markets: further evidence from nonlinear modeling. [Preprint — verificar versión publicada].</w:t>
+      </w:r>
+    </w:p>
+    <w:p>
+      <w:pPr>
+        <w:pStyle w:val="IntenseQuote"/>
+      </w:pPr>
+      <w:r>
+        <w:t>Las referencias de este bloque fueron verificadas con DOI durante la investigación</w:t>
+      </w:r>
+    </w:p>
+    <w:p>
+      <w:pPr>
+        <w:pStyle w:val="IntenseQuote"/>
+      </w:pPr>
+      <w:r>
+        <w:t>bibliográfica de apoyo; restan por confirmar volumen/páginas exactos de algunas</w:t>
+      </w:r>
+    </w:p>
+    <w:p>
+      <w:pPr>
+        <w:pStyle w:val="IntenseQuote"/>
+      </w:pPr>
+      <w:r>
+        <w:t>(Amihud et al., 2015; Jawadi et al., 2009) antes de la entrega final.</w:t>
+      </w:r>
+    </w:p>
+    <w:p>
+      <w:r/>
+      <w:r>
+        <w:rPr>
+          <w:b/>
+        </w:rPr>
+        <w:t>Data Availability Statement.</w:t>
+      </w:r>
+      <w:r>
+        <w:t xml:space="preserve"> Todos los datos provienen de fuentes públicas:</w:t>
+      </w:r>
+    </w:p>
+    <w:p>
+      <w:r>
+        <w:t>precios y volúmenes de Yahoo Finance (descarga 2026-05-30, vía la librería yfinance)</w:t>
+      </w:r>
+    </w:p>
+    <w:p>
+      <w:r>
+        <w:t>y macro de Chile de la API pública mindicador.cl (TPM, IMACEC, IPC, dólar</w:t>
+      </w:r>
+    </w:p>
+    <w:p>
+      <w:r>
+        <w:t>observado). El código de descarga, limpieza, estimación y exportación, los datos</w:t>
+      </w:r>
+    </w:p>
+    <w:p>
+      <w:r>
+        <w:t>procesados, las 35+ tablas de salida y las 13 figuras están disponibles en el</w:t>
+      </w:r>
+    </w:p>
+    <w:p>
+      <w:r>
+        <w:t>repositorio del proyecto, con scripts numerados que reproducen cada tabla y figura.</w:t>
+      </w:r>
+    </w:p>
+    <w:p>
+      <w:r>
+        <w:t>No se emplearon datos propietarios ni restringidos.</w:t>
       </w:r>
     </w:p>
     <w:p>

</xml_diff>

<commit_message>
feat: predictor en la plataforma (simulador what-if + backtest OOS) + tesis 45 pág + infra
- src/predictor.py: backtest OOS (retorno t+1), R2-OOS, RMSE vs naive, precisión
  direccional (corrige bugs: fórmula R2 y signo en días de retorno cero).
- Plataforma: sección Predictor con simulador interactivo (cobre×horizonte→precio),
  gráfico backtest real vs predicho y métricas honestas; nav y secciones renumeradas.
- Tesis: §6.16 aplicación predictiva (Pucobre más predecible → refuerza H5); 45 pág.
- Infra: run_all.py incluye quiebres, iliquidez_robustez, out_of_sample, predictor,
  exportar_web_data, exportar_pdf, exportar_ppt.
- Predictor en la plataforma (proyecto aplicado); la tesis sigue siendo explicativa.

Co-Authored-By: Claude Opus 4.8 <noreply@anthropic.com>
</commit_message>
<xml_diff>
--- a/docs/Tesis_USS.docx
+++ b/docs/Tesis_USS.docx
@@ -11834,7 +11834,449 @@
         <w:pStyle w:val="Heading3"/>
       </w:pPr>
       <w:r>
-        <w:t>6.16 Síntesis de verificación de hipótesis</w:t>
+        <w:t>6.16 Aplicación predictiva (validación complementaria)</w:t>
+      </w:r>
+    </w:p>
+    <w:p>
+      <w:r>
+        <w:t xml:space="preserve">Aunque el enfoque de la tesis es </w:t>
+      </w:r>
+      <w:r>
+        <w:rPr>
+          <w:b/>
+        </w:rPr>
+        <w:t>explicativo</w:t>
+      </w:r>
+      <w:r>
+        <w:t>, no predictivo, una validación</w:t>
+      </w:r>
+    </w:p>
+    <w:p>
+      <w:r>
+        <w:t>predictiva fuera de muestra ofrece un contraste adicional del mecanismo y una</w:t>
+      </w:r>
+    </w:p>
+    <w:p>
+      <w:r>
+        <w:t>aplicación práctica. Se estima un modelo lineal transparente que predice el retorno</w:t>
+      </w:r>
+    </w:p>
+    <w:p>
+      <w:r>
+        <w:t>del día siguiente con información disponible hoy —retorno propio rezagado, cobre</w:t>
+      </w:r>
+    </w:p>
+    <w:p>
+      <w:r>
+        <w:t xml:space="preserve">contemporáneo y rezagado, dólar y mercado— en una ventana </w:t>
+      </w:r>
+      <w:r>
+        <w:rPr>
+          <w:b/>
+        </w:rPr>
+        <w:t>expansiva</w:t>
+      </w:r>
+      <w:r>
+        <w:t xml:space="preserve"> (estimación</w:t>
+      </w:r>
+    </w:p>
+    <w:p>
+      <w:r>
+        <w:t>recursiva), y se compara contra un benchmark ingenuo (predecir retorno nulo, esto</w:t>
+      </w:r>
+    </w:p>
+    <w:p>
+      <w:r>
+        <w:t>es, caminata aleatoria del precio):</w:t>
+      </w:r>
+    </w:p>
+    <w:tbl>
+      <w:tblPr>
+        <w:tblStyle w:val="LightGrid-Accent1"/>
+        <w:tblW w:type="auto" w:w="0"/>
+        <w:jc w:val="center"/>
+        <w:tblLook w:firstColumn="1" w:firstRow="1" w:lastColumn="0" w:lastRow="0" w:noHBand="0" w:noVBand="1" w:val="04A0"/>
+      </w:tblPr>
+      <w:tblGrid>
+        <w:gridCol w:w="2280"/>
+        <w:gridCol w:w="2280"/>
+        <w:gridCol w:w="2280"/>
+        <w:gridCol w:w="2280"/>
+      </w:tblGrid>
+      <w:tr>
+        <w:tc>
+          <w:tcPr>
+            <w:tcW w:type="dxa" w:w="2280"/>
+            <w:shd w:val="clear" w:fill="1B2A41"/>
+          </w:tcPr>
+          <w:p>
+            <w:pPr>
+              <w:jc w:val="center"/>
+            </w:pPr>
+            <w:r/>
+            <w:r>
+              <w:rPr>
+                <w:rFonts w:ascii="Times New Roman" w:hAnsi="Times New Roman"/>
+                <w:b/>
+                <w:color w:val="FFFFFF"/>
+                <w:sz w:val="19"/>
+              </w:rPr>
+              <w:t>Activo</w:t>
+            </w:r>
+          </w:p>
+        </w:tc>
+        <w:tc>
+          <w:tcPr>
+            <w:tcW w:type="dxa" w:w="2280"/>
+            <w:shd w:val="clear" w:fill="1B2A41"/>
+          </w:tcPr>
+          <w:p>
+            <w:pPr>
+              <w:jc w:val="center"/>
+            </w:pPr>
+            <w:r/>
+            <w:r>
+              <w:rPr>
+                <w:rFonts w:ascii="Times New Roman" w:hAnsi="Times New Roman"/>
+                <w:b/>
+                <w:color w:val="FFFFFF"/>
+                <w:sz w:val="19"/>
+              </w:rPr>
+              <w:t>R² fuera de muestra</w:t>
+            </w:r>
+          </w:p>
+        </w:tc>
+        <w:tc>
+          <w:tcPr>
+            <w:tcW w:type="dxa" w:w="2280"/>
+            <w:shd w:val="clear" w:fill="1B2A41"/>
+          </w:tcPr>
+          <w:p>
+            <w:pPr>
+              <w:jc w:val="center"/>
+            </w:pPr>
+            <w:r/>
+            <w:r>
+              <w:rPr>
+                <w:rFonts w:ascii="Times New Roman" w:hAnsi="Times New Roman"/>
+                <w:b/>
+                <w:color w:val="FFFFFF"/>
+                <w:sz w:val="19"/>
+              </w:rPr>
+              <w:t>Mejora RMSE vs naive</w:t>
+            </w:r>
+          </w:p>
+        </w:tc>
+        <w:tc>
+          <w:tcPr>
+            <w:tcW w:type="dxa" w:w="2280"/>
+            <w:shd w:val="clear" w:fill="1B2A41"/>
+          </w:tcPr>
+          <w:p>
+            <w:pPr>
+              <w:jc w:val="center"/>
+            </w:pPr>
+            <w:r/>
+            <w:r>
+              <w:rPr>
+                <w:rFonts w:ascii="Times New Roman" w:hAnsi="Times New Roman"/>
+                <w:b/>
+                <w:color w:val="FFFFFF"/>
+                <w:sz w:val="19"/>
+              </w:rPr>
+              <w:t>Precisión direccional*</w:t>
+            </w:r>
+          </w:p>
+        </w:tc>
+      </w:tr>
+      <w:tr>
+        <w:tc>
+          <w:tcPr>
+            <w:tcW w:type="dxa" w:w="2280"/>
+          </w:tcPr>
+          <w:p>
+            <w:pPr>
+              <w:jc w:val="center"/>
+            </w:pPr>
+            <w:r/>
+            <w:r>
+              <w:rPr>
+                <w:rFonts w:ascii="Times New Roman" w:hAnsi="Times New Roman"/>
+                <w:sz w:val="19"/>
+              </w:rPr>
+              <w:t>ANTO.L</w:t>
+            </w:r>
+          </w:p>
+        </w:tc>
+        <w:tc>
+          <w:tcPr>
+            <w:tcW w:type="dxa" w:w="2280"/>
+          </w:tcPr>
+          <w:p>
+            <w:pPr>
+              <w:jc w:val="center"/>
+            </w:pPr>
+            <w:r/>
+            <w:r>
+              <w:rPr>
+                <w:rFonts w:ascii="Times New Roman" w:hAnsi="Times New Roman"/>
+                <w:sz w:val="19"/>
+              </w:rPr>
+              <w:t>−0.7%</w:t>
+            </w:r>
+          </w:p>
+        </w:tc>
+        <w:tc>
+          <w:tcPr>
+            <w:tcW w:type="dxa" w:w="2280"/>
+          </w:tcPr>
+          <w:p>
+            <w:pPr>
+              <w:jc w:val="center"/>
+            </w:pPr>
+            <w:r/>
+            <w:r>
+              <w:rPr>
+                <w:rFonts w:ascii="Times New Roman" w:hAnsi="Times New Roman"/>
+                <w:sz w:val="19"/>
+              </w:rPr>
+              <w:t>−0.3%</w:t>
+            </w:r>
+          </w:p>
+        </w:tc>
+        <w:tc>
+          <w:tcPr>
+            <w:tcW w:type="dxa" w:w="2280"/>
+          </w:tcPr>
+          <w:p>
+            <w:pPr>
+              <w:jc w:val="center"/>
+            </w:pPr>
+            <w:r/>
+            <w:r>
+              <w:rPr>
+                <w:rFonts w:ascii="Times New Roman" w:hAnsi="Times New Roman"/>
+                <w:sz w:val="19"/>
+              </w:rPr>
+              <w:t>54.2%</w:t>
+            </w:r>
+          </w:p>
+        </w:tc>
+      </w:tr>
+      <w:tr>
+        <w:tc>
+          <w:tcPr>
+            <w:tcW w:type="dxa" w:w="2280"/>
+          </w:tcPr>
+          <w:p>
+            <w:pPr>
+              <w:jc w:val="center"/>
+            </w:pPr>
+            <w:r/>
+            <w:r>
+              <w:rPr>
+                <w:rFonts w:ascii="Times New Roman" w:hAnsi="Times New Roman"/>
+                <w:sz w:val="19"/>
+              </w:rPr>
+              <w:t>PUCOBRE.SN</w:t>
+            </w:r>
+          </w:p>
+        </w:tc>
+        <w:tc>
+          <w:tcPr>
+            <w:tcW w:type="dxa" w:w="2280"/>
+          </w:tcPr>
+          <w:p>
+            <w:pPr>
+              <w:jc w:val="center"/>
+            </w:pPr>
+            <w:r/>
+            <w:r>
+              <w:rPr>
+                <w:rFonts w:ascii="Times New Roman" w:hAnsi="Times New Roman"/>
+                <w:sz w:val="19"/>
+              </w:rPr>
+              <w:t>+1.2%</w:t>
+            </w:r>
+          </w:p>
+        </w:tc>
+        <w:tc>
+          <w:tcPr>
+            <w:tcW w:type="dxa" w:w="2280"/>
+          </w:tcPr>
+          <w:p>
+            <w:pPr>
+              <w:jc w:val="center"/>
+            </w:pPr>
+            <w:r/>
+            <w:r>
+              <w:rPr>
+                <w:rFonts w:ascii="Times New Roman" w:hAnsi="Times New Roman"/>
+                <w:sz w:val="19"/>
+              </w:rPr>
+              <w:t>+0.6%</w:t>
+            </w:r>
+          </w:p>
+        </w:tc>
+        <w:tc>
+          <w:tcPr>
+            <w:tcW w:type="dxa" w:w="2280"/>
+          </w:tcPr>
+          <w:p>
+            <w:pPr>
+              <w:jc w:val="center"/>
+            </w:pPr>
+            <w:r/>
+            <w:r>
+              <w:rPr>
+                <w:rFonts w:ascii="Times New Roman" w:hAnsi="Times New Roman"/>
+                <w:sz w:val="19"/>
+              </w:rPr>
+              <w:t>56.6%</w:t>
+            </w:r>
+          </w:p>
+        </w:tc>
+      </w:tr>
+    </w:tbl>
+    <w:p>
+      <w:pPr>
+        <w:spacing w:after="80"/>
+      </w:pPr>
+    </w:p>
+    <w:p>
+      <w:r>
+        <w:t xml:space="preserve">(*) Precisión direccional calculada </w:t>
+      </w:r>
+      <w:r>
+        <w:rPr>
+          <w:b/>
+        </w:rPr>
+        <w:t>sólo sobre días de retorno no nulo</w:t>
+      </w:r>
+      <w:r>
+        <w:t>, para</w:t>
+      </w:r>
+    </w:p>
+    <w:p>
+      <w:r>
+        <w:t>evitar el sesgo que introducen los numerosos días sin transacción de Pucobre</w:t>
+      </w:r>
+    </w:p>
+    <w:p>
+      <w:r>
+        <w:t>(donde el signo del retorno observado es cero).</w:t>
+      </w:r>
+    </w:p>
+    <w:p>
+      <w:r>
+        <w:t xml:space="preserve">Dos lecturas honestas: (i) el retorno </w:t>
+      </w:r>
+      <w:r>
+        <w:rPr>
+          <w:b/>
+        </w:rPr>
+        <w:t>diario</w:t>
+      </w:r>
+      <w:r>
+        <w:t xml:space="preserve"> es esencialmente </w:t>
+      </w:r>
+      <w:r>
+        <w:rPr>
+          <w:b/>
+        </w:rPr>
+        <w:t>impredecible</w:t>
+      </w:r>
+      <w:r/>
+    </w:p>
+    <w:p>
+      <w:r>
+        <w:t>—coherente con eficiencia de mercado en forma débil—, con R² fuera de muestra ínfimo</w:t>
+      </w:r>
+    </w:p>
+    <w:p>
+      <w:r>
+        <w:t>y precisión direccional apenas sobre el 50%; (ii) sin embargo, **Pucobre es</w:t>
+      </w:r>
+    </w:p>
+    <w:p>
+      <w:r>
+        <w:t>sistemáticamente más predecible que Antofagasta** (mayor precisión direccional,</w:t>
+      </w:r>
+    </w:p>
+    <w:p>
+      <w:r>
+        <w:t>única con R² fuera de muestra y RMSE mejores que el benchmark). Esta mayor</w:t>
+      </w:r>
+    </w:p>
+    <w:p>
+      <w:r>
+        <w:t>predictibilidad del activo ilíquido es precisamente lo que implica el descubrimiento</w:t>
+      </w:r>
+    </w:p>
+    <w:p>
+      <w:r>
+        <w:t>de precios diferido: la incorporación tardía de la información genera</w:t>
+      </w:r>
+    </w:p>
+    <w:p>
+      <w:r/>
+      <w:r>
+        <w:rPr>
+          <w:b/>
+        </w:rPr>
+        <w:t>autocorrelación</w:t>
+      </w:r>
+      <w:r>
+        <w:t xml:space="preserve"> explotable. Así, la dimensión predictiva </w:t>
+      </w:r>
+      <w:r>
+        <w:rPr>
+          <w:b/>
+        </w:rPr>
+        <w:t>refuerza</w:t>
+      </w:r>
+      <w:r>
+        <w:t xml:space="preserve"> el hallazgo</w:t>
+      </w:r>
+    </w:p>
+    <w:p>
+      <w:r>
+        <w:t>explicativo central por una vía independiente. La plataforma asociada incluye un</w:t>
+      </w:r>
+    </w:p>
+    <w:p>
+      <w:r/>
+      <w:r>
+        <w:rPr>
+          <w:b/>
+        </w:rPr>
+        <w:t>simulador de escenarios</w:t>
+      </w:r>
+      <w:r>
+        <w:t xml:space="preserve"> que traduce las elasticidades estimadas en impactos por</w:t>
+      </w:r>
+    </w:p>
+    <w:p>
+      <w:r>
+        <w:t>horizonte; su utilidad no radica en el pronóstico puntual —imposible para retornos</w:t>
+      </w:r>
+    </w:p>
+    <w:p>
+      <w:r>
+        <w:t>diarios— sino en cuantificar, de forma trazable, el rango de impacto de un escenario</w:t>
+      </w:r>
+    </w:p>
+    <w:p>
+      <w:r>
+        <w:t>de cobre.</w:t>
+      </w:r>
+    </w:p>
+    <w:p>
+      <w:pPr>
+        <w:pStyle w:val="Heading3"/>
+      </w:pPr>
+      <w:r>
+        <w:t>6.17 Síntesis de verificación de hipótesis</w:t>
       </w:r>
     </w:p>
     <w:tbl>

</xml_diff>

<commit_message>
tesis: mejora incremental autónoma (interpretación del perfil FEVD por horizonte en 6.4)
Profundiza la lectura económica de la descomposición de varianza: el perfil
creciente de la FEVD del cobre en Pucobre (2.03%->4.32%, +113%) frente al plano
de Antofagasta (28.68%->27.79%) como firma econométrica de la transmisión
diferida vs. contemporánea. Cifras exactas a outputs/tables/var_fevd_*.csv.

Co-Authored-By: Claude Opus 4.8 (1M context) <noreply@anthropic.com>
</commit_message>
<xml_diff>
--- a/docs/Tesis_USS.docx
+++ b/docs/Tesis_USS.docx
@@ -17273,7 +17273,95 @@
           <w:b w:val="0"/>
           <w:i w:val="0"/>
         </w:rPr>
-        <w:t xml:space="preserve"> en lugar de impactar contemporáneamente — consistente con descubrimiento de precios lento. Las funciones impulso-respuesta de ambos activos ilustran el contraste: la de Antofagasta se concentra en el primer día, mientras que la de Pucobre se acumula durante las jornadas siguientes.</w:t>
+        <w:t xml:space="preserve"> en lugar de impactar contemporáneamente — consistente con descubrimiento de precios lento.</w:t>
+      </w:r>
+    </w:p>
+    <w:p>
+      <w:r>
+        <w:rPr>
+          <w:b w:val="0"/>
+          <w:i w:val="0"/>
+        </w:rPr>
+        <w:t xml:space="preserve">El </w:t>
+      </w:r>
+      <w:r>
+        <w:rPr>
+          <w:b/>
+          <w:i w:val="0"/>
+        </w:rPr>
+        <w:t>perfil de la FEVD por horizonte</w:t>
+      </w:r>
+      <w:r>
+        <w:rPr>
+          <w:b w:val="0"/>
+          <w:i w:val="0"/>
+        </w:rPr>
+        <w:t xml:space="preserve"> es, en sí mismo, diagnóstico del mecanismo y no sólo su nivel. En Pucobre la fracción de la varianza del error de pronóstico atribuible al cobre </w:t>
+      </w:r>
+      <w:r>
+        <w:rPr>
+          <w:b/>
+          <w:i w:val="0"/>
+        </w:rPr>
+        <w:t>más que se duplica</w:t>
+      </w:r>
+      <w:r>
+        <w:rPr>
+          <w:b w:val="0"/>
+          <w:i w:val="0"/>
+        </w:rPr>
+        <w:t xml:space="preserve"> al ampliar el horizonte (2.03% a 1 día → 4.32% a 20 días, un incremento relativo de +113%), y no se estabiliza sino hacia el día ~12. En Antofagasta, en cambio, esa fracción es </w:t>
+      </w:r>
+      <w:r>
+        <w:rPr>
+          <w:b/>
+          <w:i w:val="0"/>
+        </w:rPr>
+        <w:t>prácticamente plana</w:t>
+      </w:r>
+      <w:r>
+        <w:rPr>
+          <w:b w:val="0"/>
+          <w:i w:val="0"/>
+        </w:rPr>
+        <w:t xml:space="preserve"> —de hecho marginalmente decreciente— (28.68% → 27.79%): el cobre ya explica su cuota de varianza desde el primer paso y no gana peso con el horizonte. Este contraste —una FEVD </w:t>
+      </w:r>
+      <w:r>
+        <w:rPr>
+          <w:b/>
+          <w:i w:val="0"/>
+        </w:rPr>
+        <w:t>creciente</w:t>
+      </w:r>
+      <w:r>
+        <w:rPr>
+          <w:b w:val="0"/>
+          <w:i w:val="0"/>
+        </w:rPr>
+        <w:t xml:space="preserve"> frente a una FEVD </w:t>
+      </w:r>
+      <w:r>
+        <w:rPr>
+          <w:b/>
+          <w:i w:val="0"/>
+        </w:rPr>
+        <w:t>plana</w:t>
+      </w:r>
+      <w:r>
+        <w:rPr>
+          <w:b w:val="0"/>
+          <w:i w:val="0"/>
+        </w:rPr>
+        <w:t>— es la contraparte, en el dominio de la descomposición de varianza, del mismo fenómeno que capturan las betas por horizonte: una participación del cobre que sube con el horizonte es la firma econométrica de información que se incorpora con rezago, mientras que una participación plana desde el impacto es la de información ya descontada contemporáneamente. Que en Pucobre el nivel absoluto de la FEVD sea bajo (4.3% frente al ~28% de Antofagasta) no contradice el hallazgo: a frecuencia diaria la varianza de un activo tan ilíquido está dominada por su propio ruido de microestructura —los saltos discretos entre transacciones explican ~94% de su varianza—, de modo que el canal fundamental sólo se manifiesta plenamente al agregar el tiempo, como confirman los modelos mensual y de largo plazo (§6.5, §6.12).</w:t>
+      </w:r>
+    </w:p>
+    <w:p>
+      <w:r>
+        <w:rPr>
+          <w:b w:val="0"/>
+          <w:i w:val="0"/>
+        </w:rPr>
+        <w:t>Las funciones impulso-respuesta de ambos activos ilustran el mismo contraste: la de Antofagasta se concentra en el primer día, mientras que la de Pucobre se acumula durante las jornadas siguientes.</w:t>
       </w:r>
     </w:p>
     <w:p>

</xml_diff>